<commit_message>
Add report appendix with evidence summaries
</commit_message>
<xml_diff>
--- a/report/MILS_AI_Claim_Audit_Report_Word.docx
+++ b/report/MILS_AI_Claim_Audit_Report_Word.docx
@@ -3399,6 +3399,4291 @@
           <w:lang w:eastAsia="zh-TW"/>
         </w:rPr>
         <w:t>這說明 AI 的通用直覺有參考價值，但仍必須透過具體 evidence 進行審核。</w:t>
+      </w:r>
+    </w:p>
+    <w:p>
+      <w:r>
+        <w:br w:type="page"/>
+      </w:r>
+    </w:p>
+    <w:p>
+      <w:pPr>
+        <w:pStyle w:val="1"/>
+        <w:jc w:val="left"/>
+      </w:pPr>
+      <w:r>
+        <w:t>附錄：實驗結果摘要</w:t>
+      </w:r>
+    </w:p>
+    <w:p>
+      <w:r>
+        <w:rPr>
+          <w:sz w:val="18"/>
+        </w:rPr>
+        <w:t>本附錄整理正文結論所依據的關鍵實驗數據。由於校內提交系統要求不要另外上傳 code 執行產物，本報告僅將必要結果摘要嵌入文件；完整 CSV 與可重跑程式碼保留於 GitHub repository。</w:t>
+      </w:r>
+    </w:p>
+    <w:p>
+      <w:pPr>
+        <w:pStyle w:val="21"/>
+      </w:pPr>
+      <w:r>
+        <w:t>A. Claim audit 摘要</w:t>
+      </w:r>
+    </w:p>
+    <w:tbl>
+      <w:tblPr>
+        <w:tblStyle w:val="aff2"/>
+        <w:tblW w:type="auto" w:w="0"/>
+        <w:jc w:val="center"/>
+        <w:tblLook w:firstColumn="1" w:firstRow="1" w:lastColumn="0" w:lastRow="0" w:noHBand="0" w:noVBand="1" w:val="04A0"/>
+      </w:tblPr>
+      <w:tblGrid>
+        <w:gridCol w:w="3456"/>
+        <w:gridCol w:w="3456"/>
+        <w:gridCol w:w="3456"/>
+      </w:tblGrid>
+      <w:tr>
+        <w:tc>
+          <w:tcPr>
+            <w:tcW w:type="dxa" w:w="3456"/>
+            <w:vAlign w:val="center"/>
+          </w:tcPr>
+          <w:p>
+            <w:pPr>
+              <w:jc w:val="center"/>
+            </w:pPr>
+            <w:r>
+              <w:rPr>
+                <w:b/>
+                <w:sz w:val="15"/>
+              </w:rPr>
+              <w:t>Claim</w:t>
+            </w:r>
+          </w:p>
+        </w:tc>
+        <w:tc>
+          <w:tcPr>
+            <w:tcW w:type="dxa" w:w="3456"/>
+            <w:vAlign w:val="center"/>
+          </w:tcPr>
+          <w:p>
+            <w:pPr>
+              <w:jc w:val="center"/>
+            </w:pPr>
+            <w:r>
+              <w:rPr>
+                <w:b/>
+                <w:sz w:val="15"/>
+              </w:rPr>
+              <w:t>判定</w:t>
+            </w:r>
+          </w:p>
+        </w:tc>
+        <w:tc>
+          <w:tcPr>
+            <w:tcW w:type="dxa" w:w="3456"/>
+            <w:vAlign w:val="center"/>
+          </w:tcPr>
+          <w:p>
+            <w:pPr>
+              <w:jc w:val="center"/>
+            </w:pPr>
+            <w:r>
+              <w:rPr>
+                <w:b/>
+                <w:sz w:val="15"/>
+              </w:rPr>
+              <w:t>關鍵 evidence 摘要</w:t>
+            </w:r>
+          </w:p>
+        </w:tc>
+      </w:tr>
+      <w:tr>
+        <w:tc>
+          <w:tcPr>
+            <w:tcW w:type="dxa" w:w="3456"/>
+            <w:vAlign w:val="center"/>
+          </w:tcPr>
+          <w:p>
+            <w:pPr>
+              <w:jc w:val="center"/>
+            </w:pPr>
+            <w:r>
+              <w:rPr>
+                <w:b w:val="0"/>
+                <w:sz w:val="15"/>
+              </w:rPr>
+              <w:t>C1</w:t>
+            </w:r>
+          </w:p>
+        </w:tc>
+        <w:tc>
+          <w:tcPr>
+            <w:tcW w:type="dxa" w:w="3456"/>
+            <w:vAlign w:val="center"/>
+          </w:tcPr>
+          <w:p>
+            <w:pPr>
+              <w:jc w:val="center"/>
+            </w:pPr>
+            <w:r>
+              <w:rPr>
+                <w:b w:val="0"/>
+                <w:sz w:val="15"/>
+              </w:rPr>
+              <w:t>支持</w:t>
+            </w:r>
+          </w:p>
+        </w:tc>
+        <w:tc>
+          <w:tcPr>
+            <w:tcW w:type="dxa" w:w="3456"/>
+            <w:vAlign w:val="center"/>
+          </w:tcPr>
+          <w:p>
+            <w:pPr>
+              <w:jc w:val="center"/>
+            </w:pPr>
+            <w:r>
+              <w:rPr>
+                <w:b w:val="0"/>
+                <w:sz w:val="15"/>
+              </w:rPr>
+              <w:t>Standard 在 3/3 個 severity 中，Gaussian noise 的 accuracy drop 都高於 motion blur。</w:t>
+            </w:r>
+          </w:p>
+        </w:tc>
+      </w:tr>
+      <w:tr>
+        <w:tc>
+          <w:tcPr>
+            <w:tcW w:type="dxa" w:w="3456"/>
+            <w:vAlign w:val="center"/>
+          </w:tcPr>
+          <w:p>
+            <w:pPr>
+              <w:jc w:val="center"/>
+            </w:pPr>
+            <w:r>
+              <w:rPr>
+                <w:b w:val="0"/>
+                <w:sz w:val="15"/>
+              </w:rPr>
+              <w:t>C2</w:t>
+            </w:r>
+          </w:p>
+        </w:tc>
+        <w:tc>
+          <w:tcPr>
+            <w:tcW w:type="dxa" w:w="3456"/>
+            <w:vAlign w:val="center"/>
+          </w:tcPr>
+          <w:p>
+            <w:pPr>
+              <w:jc w:val="center"/>
+            </w:pPr>
+            <w:r>
+              <w:rPr>
+                <w:b w:val="0"/>
+                <w:sz w:val="15"/>
+              </w:rPr>
+              <w:t>部分支持</w:t>
+            </w:r>
+          </w:p>
+        </w:tc>
+        <w:tc>
+          <w:tcPr>
+            <w:tcW w:type="dxa" w:w="3456"/>
+            <w:vAlign w:val="center"/>
+          </w:tcPr>
+          <w:p>
+            <w:pPr>
+              <w:jc w:val="center"/>
+            </w:pPr>
+            <w:r>
+              <w:rPr>
+                <w:b w:val="0"/>
+                <w:sz w:val="15"/>
+              </w:rPr>
+              <w:t>AugMix-WRN 的 Gaussian mean relative drop 較低（0.151 vs 0.491）；但 JPEG 也較低（0.073 vs 0.177），因此「JPEG 不一定有優勢」只部分成立。</w:t>
+            </w:r>
+          </w:p>
+        </w:tc>
+      </w:tr>
+      <w:tr>
+        <w:tc>
+          <w:tcPr>
+            <w:tcW w:type="dxa" w:w="3456"/>
+            <w:vAlign w:val="center"/>
+          </w:tcPr>
+          <w:p>
+            <w:pPr>
+              <w:jc w:val="center"/>
+            </w:pPr>
+            <w:r>
+              <w:rPr>
+                <w:b w:val="0"/>
+                <w:sz w:val="15"/>
+              </w:rPr>
+              <w:t>C3</w:t>
+            </w:r>
+          </w:p>
+        </w:tc>
+        <w:tc>
+          <w:tcPr>
+            <w:tcW w:type="dxa" w:w="3456"/>
+            <w:vAlign w:val="center"/>
+          </w:tcPr>
+          <w:p>
+            <w:pPr>
+              <w:jc w:val="center"/>
+            </w:pPr>
+            <w:r>
+              <w:rPr>
+                <w:b w:val="0"/>
+                <w:sz w:val="15"/>
+              </w:rPr>
+              <w:t>支持</w:t>
+            </w:r>
+          </w:p>
+        </w:tc>
+        <w:tc>
+          <w:tcPr>
+            <w:tcW w:type="dxa" w:w="3456"/>
+            <w:vAlign w:val="center"/>
+          </w:tcPr>
+          <w:p>
+            <w:pPr>
+              <w:jc w:val="center"/>
+            </w:pPr>
+            <w:r>
+              <w:rPr>
+                <w:b w:val="0"/>
+                <w:sz w:val="15"/>
+              </w:rPr>
+              <w:t>選出的 corruption failure cases 中最高錯誤信心為 1.000，證明 high-confidence wrong prediction 存在。</w:t>
+            </w:r>
+          </w:p>
+        </w:tc>
+      </w:tr>
+      <w:tr>
+        <w:tc>
+          <w:tcPr>
+            <w:tcW w:type="dxa" w:w="3456"/>
+            <w:vAlign w:val="center"/>
+          </w:tcPr>
+          <w:p>
+            <w:pPr>
+              <w:jc w:val="center"/>
+            </w:pPr>
+            <w:r>
+              <w:rPr>
+                <w:b w:val="0"/>
+                <w:sz w:val="15"/>
+              </w:rPr>
+              <w:t>C4</w:t>
+            </w:r>
+          </w:p>
+        </w:tc>
+        <w:tc>
+          <w:tcPr>
+            <w:tcW w:type="dxa" w:w="3456"/>
+            <w:vAlign w:val="center"/>
+          </w:tcPr>
+          <w:p>
+            <w:pPr>
+              <w:jc w:val="center"/>
+            </w:pPr>
+            <w:r>
+              <w:rPr>
+                <w:b w:val="0"/>
+                <w:sz w:val="15"/>
+              </w:rPr>
+              <w:t>部分支持</w:t>
+            </w:r>
+          </w:p>
+        </w:tc>
+        <w:tc>
+          <w:tcPr>
+            <w:tcW w:type="dxa" w:w="3456"/>
+            <w:vAlign w:val="center"/>
+          </w:tcPr>
+          <w:p>
+            <w:pPr>
+              <w:jc w:val="center"/>
+            </w:pPr>
+            <w:r>
+              <w:rPr>
+                <w:b w:val="0"/>
+                <w:sz w:val="15"/>
+              </w:rPr>
+              <w:t>TTA 改善 worst-condition accuracy，但 clean accuracy 沒有下降，因此雙刃劍說法只部分成立。</w:t>
+            </w:r>
+          </w:p>
+        </w:tc>
+      </w:tr>
+      <w:tr>
+        <w:tc>
+          <w:tcPr>
+            <w:tcW w:type="dxa" w:w="3456"/>
+            <w:vAlign w:val="center"/>
+          </w:tcPr>
+          <w:p>
+            <w:pPr>
+              <w:jc w:val="center"/>
+            </w:pPr>
+            <w:r>
+              <w:rPr>
+                <w:b w:val="0"/>
+                <w:sz w:val="15"/>
+              </w:rPr>
+              <w:t>C5</w:t>
+            </w:r>
+          </w:p>
+        </w:tc>
+        <w:tc>
+          <w:tcPr>
+            <w:tcW w:type="dxa" w:w="3456"/>
+            <w:vAlign w:val="center"/>
+          </w:tcPr>
+          <w:p>
+            <w:pPr>
+              <w:jc w:val="center"/>
+            </w:pPr>
+            <w:r>
+              <w:rPr>
+                <w:b w:val="0"/>
+                <w:sz w:val="15"/>
+              </w:rPr>
+              <w:t>部分支持</w:t>
+            </w:r>
+          </w:p>
+        </w:tc>
+        <w:tc>
+          <w:tcPr>
+            <w:tcW w:type="dxa" w:w="3456"/>
+            <w:vAlign w:val="center"/>
+          </w:tcPr>
+          <w:p>
+            <w:pPr>
+              <w:jc w:val="center"/>
+            </w:pPr>
+            <w:r>
+              <w:rPr>
+                <w:b w:val="0"/>
+                <w:sz w:val="15"/>
+              </w:rPr>
+              <w:t>Severity 5 的平均 failure overlap 高於 severity 1，但只有 2/5 corruption 呈現一致上升。</w:t>
+            </w:r>
+          </w:p>
+        </w:tc>
+      </w:tr>
+    </w:tbl>
+    <w:p/>
+    <w:p>
+      <w:pPr>
+        <w:jc w:val="center"/>
+      </w:pPr>
+      <w:r>
+        <w:rPr>
+          <w:i/>
+          <w:sz w:val="16"/>
+        </w:rPr>
+        <w:t>附錄表 A1。五個 AI claims 的審核結果與主要 evidence。</w:t>
+      </w:r>
+    </w:p>
+    <w:p>
+      <w:pPr>
+        <w:pStyle w:val="21"/>
+      </w:pPr>
+      <w:r>
+        <w:t>B. 主要 accuracy 結果</w:t>
+      </w:r>
+    </w:p>
+    <w:tbl>
+      <w:tblPr>
+        <w:tblStyle w:val="aff2"/>
+        <w:tblW w:type="auto" w:w="0"/>
+        <w:jc w:val="center"/>
+        <w:tblLook w:firstColumn="1" w:firstRow="1" w:lastColumn="0" w:lastRow="0" w:noHBand="0" w:noVBand="1" w:val="04A0"/>
+      </w:tblPr>
+      <w:tblGrid>
+        <w:gridCol w:w="1481"/>
+        <w:gridCol w:w="1481"/>
+        <w:gridCol w:w="1481"/>
+        <w:gridCol w:w="1481"/>
+        <w:gridCol w:w="1481"/>
+        <w:gridCol w:w="1481"/>
+        <w:gridCol w:w="1481"/>
+      </w:tblGrid>
+      <w:tr>
+        <w:tc>
+          <w:tcPr>
+            <w:tcW w:type="dxa" w:w="1481"/>
+            <w:vAlign w:val="center"/>
+          </w:tcPr>
+          <w:p>
+            <w:pPr>
+              <w:jc w:val="center"/>
+            </w:pPr>
+            <w:r>
+              <w:rPr>
+                <w:b/>
+                <w:sz w:val="14"/>
+              </w:rPr>
+              <w:t>模型</w:t>
+            </w:r>
+          </w:p>
+        </w:tc>
+        <w:tc>
+          <w:tcPr>
+            <w:tcW w:type="dxa" w:w="1481"/>
+            <w:vAlign w:val="center"/>
+          </w:tcPr>
+          <w:p>
+            <w:pPr>
+              <w:jc w:val="center"/>
+            </w:pPr>
+            <w:r>
+              <w:rPr>
+                <w:b/>
+                <w:sz w:val="14"/>
+              </w:rPr>
+              <w:t>條件</w:t>
+            </w:r>
+          </w:p>
+        </w:tc>
+        <w:tc>
+          <w:tcPr>
+            <w:tcW w:type="dxa" w:w="1481"/>
+            <w:vAlign w:val="center"/>
+          </w:tcPr>
+          <w:p>
+            <w:pPr>
+              <w:jc w:val="center"/>
+            </w:pPr>
+            <w:r>
+              <w:rPr>
+                <w:b/>
+                <w:sz w:val="14"/>
+              </w:rPr>
+              <w:t>Severity</w:t>
+            </w:r>
+          </w:p>
+        </w:tc>
+        <w:tc>
+          <w:tcPr>
+            <w:tcW w:type="dxa" w:w="1481"/>
+            <w:vAlign w:val="center"/>
+          </w:tcPr>
+          <w:p>
+            <w:pPr>
+              <w:jc w:val="center"/>
+            </w:pPr>
+            <w:r>
+              <w:rPr>
+                <w:b/>
+                <w:sz w:val="14"/>
+              </w:rPr>
+              <w:t>Accuracy</w:t>
+            </w:r>
+          </w:p>
+        </w:tc>
+        <w:tc>
+          <w:tcPr>
+            <w:tcW w:type="dxa" w:w="1481"/>
+            <w:vAlign w:val="center"/>
+          </w:tcPr>
+          <w:p>
+            <w:pPr>
+              <w:jc w:val="center"/>
+            </w:pPr>
+            <w:r>
+              <w:rPr>
+                <w:b/>
+                <w:sz w:val="14"/>
+              </w:rPr>
+              <w:t>Acc. drop</w:t>
+            </w:r>
+          </w:p>
+        </w:tc>
+        <w:tc>
+          <w:tcPr>
+            <w:tcW w:type="dxa" w:w="1481"/>
+            <w:vAlign w:val="center"/>
+          </w:tcPr>
+          <w:p>
+            <w:pPr>
+              <w:jc w:val="center"/>
+            </w:pPr>
+            <w:r>
+              <w:rPr>
+                <w:b/>
+                <w:sz w:val="14"/>
+              </w:rPr>
+              <w:t>Relative drop</w:t>
+            </w:r>
+          </w:p>
+        </w:tc>
+        <w:tc>
+          <w:tcPr>
+            <w:tcW w:type="dxa" w:w="1481"/>
+            <w:vAlign w:val="center"/>
+          </w:tcPr>
+          <w:p>
+            <w:pPr>
+              <w:jc w:val="center"/>
+            </w:pPr>
+            <w:r>
+              <w:rPr>
+                <w:b/>
+                <w:sz w:val="14"/>
+              </w:rPr>
+              <w:t>Wrong conf.</w:t>
+            </w:r>
+          </w:p>
+        </w:tc>
+      </w:tr>
+      <w:tr>
+        <w:tc>
+          <w:tcPr>
+            <w:tcW w:type="dxa" w:w="1481"/>
+            <w:vAlign w:val="center"/>
+          </w:tcPr>
+          <w:p>
+            <w:pPr>
+              <w:jc w:val="center"/>
+            </w:pPr>
+            <w:r>
+              <w:rPr>
+                <w:b w:val="0"/>
+                <w:sz w:val="14"/>
+              </w:rPr>
+              <w:t>Standard</w:t>
+            </w:r>
+          </w:p>
+        </w:tc>
+        <w:tc>
+          <w:tcPr>
+            <w:tcW w:type="dxa" w:w="1481"/>
+            <w:vAlign w:val="center"/>
+          </w:tcPr>
+          <w:p>
+            <w:pPr>
+              <w:jc w:val="center"/>
+            </w:pPr>
+            <w:r>
+              <w:rPr>
+                <w:b w:val="0"/>
+                <w:sz w:val="14"/>
+              </w:rPr>
+              <w:t>Clean</w:t>
+            </w:r>
+          </w:p>
+        </w:tc>
+        <w:tc>
+          <w:tcPr>
+            <w:tcW w:type="dxa" w:w="1481"/>
+            <w:vAlign w:val="center"/>
+          </w:tcPr>
+          <w:p>
+            <w:pPr>
+              <w:jc w:val="center"/>
+            </w:pPr>
+            <w:r>
+              <w:rPr>
+                <w:b w:val="0"/>
+                <w:sz w:val="14"/>
+              </w:rPr>
+              <w:t>-</w:t>
+            </w:r>
+          </w:p>
+        </w:tc>
+        <w:tc>
+          <w:tcPr>
+            <w:tcW w:type="dxa" w:w="1481"/>
+            <w:vAlign w:val="center"/>
+          </w:tcPr>
+          <w:p>
+            <w:pPr>
+              <w:jc w:val="center"/>
+            </w:pPr>
+            <w:r>
+              <w:rPr>
+                <w:b w:val="0"/>
+                <w:sz w:val="14"/>
+              </w:rPr>
+              <w:t>0.9477</w:t>
+            </w:r>
+          </w:p>
+        </w:tc>
+        <w:tc>
+          <w:tcPr>
+            <w:tcW w:type="dxa" w:w="1481"/>
+            <w:vAlign w:val="center"/>
+          </w:tcPr>
+          <w:p>
+            <w:pPr>
+              <w:jc w:val="center"/>
+            </w:pPr>
+            <w:r>
+              <w:rPr>
+                <w:b w:val="0"/>
+                <w:sz w:val="14"/>
+              </w:rPr>
+              <w:t>-</w:t>
+            </w:r>
+          </w:p>
+        </w:tc>
+        <w:tc>
+          <w:tcPr>
+            <w:tcW w:type="dxa" w:w="1481"/>
+            <w:vAlign w:val="center"/>
+          </w:tcPr>
+          <w:p>
+            <w:pPr>
+              <w:jc w:val="center"/>
+            </w:pPr>
+            <w:r>
+              <w:rPr>
+                <w:b w:val="0"/>
+                <w:sz w:val="14"/>
+              </w:rPr>
+              <w:t>-</w:t>
+            </w:r>
+          </w:p>
+        </w:tc>
+        <w:tc>
+          <w:tcPr>
+            <w:tcW w:type="dxa" w:w="1481"/>
+            <w:vAlign w:val="center"/>
+          </w:tcPr>
+          <w:p>
+            <w:pPr>
+              <w:jc w:val="center"/>
+            </w:pPr>
+            <w:r>
+              <w:rPr>
+                <w:b w:val="0"/>
+                <w:sz w:val="14"/>
+              </w:rPr>
+              <w:t>-</w:t>
+            </w:r>
+          </w:p>
+        </w:tc>
+      </w:tr>
+      <w:tr>
+        <w:tc>
+          <w:tcPr>
+            <w:tcW w:type="dxa" w:w="1481"/>
+            <w:vAlign w:val="center"/>
+          </w:tcPr>
+          <w:p>
+            <w:pPr>
+              <w:jc w:val="center"/>
+            </w:pPr>
+            <w:r>
+              <w:rPr>
+                <w:b w:val="0"/>
+                <w:sz w:val="14"/>
+              </w:rPr>
+              <w:t>Robust AugMix-WRN</w:t>
+            </w:r>
+          </w:p>
+        </w:tc>
+        <w:tc>
+          <w:tcPr>
+            <w:tcW w:type="dxa" w:w="1481"/>
+            <w:vAlign w:val="center"/>
+          </w:tcPr>
+          <w:p>
+            <w:pPr>
+              <w:jc w:val="center"/>
+            </w:pPr>
+            <w:r>
+              <w:rPr>
+                <w:b w:val="0"/>
+                <w:sz w:val="14"/>
+              </w:rPr>
+              <w:t>Clean</w:t>
+            </w:r>
+          </w:p>
+        </w:tc>
+        <w:tc>
+          <w:tcPr>
+            <w:tcW w:type="dxa" w:w="1481"/>
+            <w:vAlign w:val="center"/>
+          </w:tcPr>
+          <w:p>
+            <w:pPr>
+              <w:jc w:val="center"/>
+            </w:pPr>
+            <w:r>
+              <w:rPr>
+                <w:b w:val="0"/>
+                <w:sz w:val="14"/>
+              </w:rPr>
+              <w:t>-</w:t>
+            </w:r>
+          </w:p>
+        </w:tc>
+        <w:tc>
+          <w:tcPr>
+            <w:tcW w:type="dxa" w:w="1481"/>
+            <w:vAlign w:val="center"/>
+          </w:tcPr>
+          <w:p>
+            <w:pPr>
+              <w:jc w:val="center"/>
+            </w:pPr>
+            <w:r>
+              <w:rPr>
+                <w:b w:val="0"/>
+                <w:sz w:val="14"/>
+              </w:rPr>
+              <w:t>0.9508</w:t>
+            </w:r>
+          </w:p>
+        </w:tc>
+        <w:tc>
+          <w:tcPr>
+            <w:tcW w:type="dxa" w:w="1481"/>
+            <w:vAlign w:val="center"/>
+          </w:tcPr>
+          <w:p>
+            <w:pPr>
+              <w:jc w:val="center"/>
+            </w:pPr>
+            <w:r>
+              <w:rPr>
+                <w:b w:val="0"/>
+                <w:sz w:val="14"/>
+              </w:rPr>
+              <w:t>-</w:t>
+            </w:r>
+          </w:p>
+        </w:tc>
+        <w:tc>
+          <w:tcPr>
+            <w:tcW w:type="dxa" w:w="1481"/>
+            <w:vAlign w:val="center"/>
+          </w:tcPr>
+          <w:p>
+            <w:pPr>
+              <w:jc w:val="center"/>
+            </w:pPr>
+            <w:r>
+              <w:rPr>
+                <w:b w:val="0"/>
+                <w:sz w:val="14"/>
+              </w:rPr>
+              <w:t>-</w:t>
+            </w:r>
+          </w:p>
+        </w:tc>
+        <w:tc>
+          <w:tcPr>
+            <w:tcW w:type="dxa" w:w="1481"/>
+            <w:vAlign w:val="center"/>
+          </w:tcPr>
+          <w:p>
+            <w:pPr>
+              <w:jc w:val="center"/>
+            </w:pPr>
+            <w:r>
+              <w:rPr>
+                <w:b w:val="0"/>
+                <w:sz w:val="14"/>
+              </w:rPr>
+              <w:t>-</w:t>
+            </w:r>
+          </w:p>
+        </w:tc>
+      </w:tr>
+      <w:tr>
+        <w:tc>
+          <w:tcPr>
+            <w:tcW w:type="dxa" w:w="1481"/>
+            <w:vAlign w:val="center"/>
+          </w:tcPr>
+          <w:p>
+            <w:pPr>
+              <w:jc w:val="center"/>
+            </w:pPr>
+            <w:r>
+              <w:rPr>
+                <w:b w:val="0"/>
+                <w:sz w:val="14"/>
+              </w:rPr>
+              <w:t>Standard</w:t>
+            </w:r>
+          </w:p>
+        </w:tc>
+        <w:tc>
+          <w:tcPr>
+            <w:tcW w:type="dxa" w:w="1481"/>
+            <w:vAlign w:val="center"/>
+          </w:tcPr>
+          <w:p>
+            <w:pPr>
+              <w:jc w:val="center"/>
+            </w:pPr>
+            <w:r>
+              <w:rPr>
+                <w:b w:val="0"/>
+                <w:sz w:val="14"/>
+              </w:rPr>
+              <w:t>Gaussian noise</w:t>
+            </w:r>
+          </w:p>
+        </w:tc>
+        <w:tc>
+          <w:tcPr>
+            <w:tcW w:type="dxa" w:w="1481"/>
+            <w:vAlign w:val="center"/>
+          </w:tcPr>
+          <w:p>
+            <w:pPr>
+              <w:jc w:val="center"/>
+            </w:pPr>
+            <w:r>
+              <w:rPr>
+                <w:b w:val="0"/>
+                <w:sz w:val="14"/>
+              </w:rPr>
+              <w:t>5</w:t>
+            </w:r>
+          </w:p>
+        </w:tc>
+        <w:tc>
+          <w:tcPr>
+            <w:tcW w:type="dxa" w:w="1481"/>
+            <w:vAlign w:val="center"/>
+          </w:tcPr>
+          <w:p>
+            <w:pPr>
+              <w:jc w:val="center"/>
+            </w:pPr>
+            <w:r>
+              <w:rPr>
+                <w:b w:val="0"/>
+                <w:sz w:val="14"/>
+              </w:rPr>
+              <w:t>0.2768</w:t>
+            </w:r>
+          </w:p>
+        </w:tc>
+        <w:tc>
+          <w:tcPr>
+            <w:tcW w:type="dxa" w:w="1481"/>
+            <w:vAlign w:val="center"/>
+          </w:tcPr>
+          <w:p>
+            <w:pPr>
+              <w:jc w:val="center"/>
+            </w:pPr>
+            <w:r>
+              <w:rPr>
+                <w:b w:val="0"/>
+                <w:sz w:val="14"/>
+              </w:rPr>
+              <w:t>0.6709</w:t>
+            </w:r>
+          </w:p>
+        </w:tc>
+        <w:tc>
+          <w:tcPr>
+            <w:tcW w:type="dxa" w:w="1481"/>
+            <w:vAlign w:val="center"/>
+          </w:tcPr>
+          <w:p>
+            <w:pPr>
+              <w:jc w:val="center"/>
+            </w:pPr>
+            <w:r>
+              <w:rPr>
+                <w:b w:val="0"/>
+                <w:sz w:val="14"/>
+              </w:rPr>
+              <w:t>0.7079</w:t>
+            </w:r>
+          </w:p>
+        </w:tc>
+        <w:tc>
+          <w:tcPr>
+            <w:tcW w:type="dxa" w:w="1481"/>
+            <w:vAlign w:val="center"/>
+          </w:tcPr>
+          <w:p>
+            <w:pPr>
+              <w:jc w:val="center"/>
+            </w:pPr>
+            <w:r>
+              <w:rPr>
+                <w:b w:val="0"/>
+                <w:sz w:val="14"/>
+              </w:rPr>
+              <w:t>0.8797</w:t>
+            </w:r>
+          </w:p>
+        </w:tc>
+      </w:tr>
+      <w:tr>
+        <w:tc>
+          <w:tcPr>
+            <w:tcW w:type="dxa" w:w="1481"/>
+            <w:vAlign w:val="center"/>
+          </w:tcPr>
+          <w:p>
+            <w:pPr>
+              <w:jc w:val="center"/>
+            </w:pPr>
+            <w:r>
+              <w:rPr>
+                <w:b w:val="0"/>
+                <w:sz w:val="14"/>
+              </w:rPr>
+              <w:t>Standard</w:t>
+            </w:r>
+          </w:p>
+        </w:tc>
+        <w:tc>
+          <w:tcPr>
+            <w:tcW w:type="dxa" w:w="1481"/>
+            <w:vAlign w:val="center"/>
+          </w:tcPr>
+          <w:p>
+            <w:pPr>
+              <w:jc w:val="center"/>
+            </w:pPr>
+            <w:r>
+              <w:rPr>
+                <w:b w:val="0"/>
+                <w:sz w:val="14"/>
+              </w:rPr>
+              <w:t>Motion blur</w:t>
+            </w:r>
+          </w:p>
+        </w:tc>
+        <w:tc>
+          <w:tcPr>
+            <w:tcW w:type="dxa" w:w="1481"/>
+            <w:vAlign w:val="center"/>
+          </w:tcPr>
+          <w:p>
+            <w:pPr>
+              <w:jc w:val="center"/>
+            </w:pPr>
+            <w:r>
+              <w:rPr>
+                <w:b w:val="0"/>
+                <w:sz w:val="14"/>
+              </w:rPr>
+              <w:t>5</w:t>
+            </w:r>
+          </w:p>
+        </w:tc>
+        <w:tc>
+          <w:tcPr>
+            <w:tcW w:type="dxa" w:w="1481"/>
+            <w:vAlign w:val="center"/>
+          </w:tcPr>
+          <w:p>
+            <w:pPr>
+              <w:jc w:val="center"/>
+            </w:pPr>
+            <w:r>
+              <w:rPr>
+                <w:b w:val="0"/>
+                <w:sz w:val="14"/>
+              </w:rPr>
+              <w:t>0.6524</w:t>
+            </w:r>
+          </w:p>
+        </w:tc>
+        <w:tc>
+          <w:tcPr>
+            <w:tcW w:type="dxa" w:w="1481"/>
+            <w:vAlign w:val="center"/>
+          </w:tcPr>
+          <w:p>
+            <w:pPr>
+              <w:jc w:val="center"/>
+            </w:pPr>
+            <w:r>
+              <w:rPr>
+                <w:b w:val="0"/>
+                <w:sz w:val="14"/>
+              </w:rPr>
+              <w:t>0.2953</w:t>
+            </w:r>
+          </w:p>
+        </w:tc>
+        <w:tc>
+          <w:tcPr>
+            <w:tcW w:type="dxa" w:w="1481"/>
+            <w:vAlign w:val="center"/>
+          </w:tcPr>
+          <w:p>
+            <w:pPr>
+              <w:jc w:val="center"/>
+            </w:pPr>
+            <w:r>
+              <w:rPr>
+                <w:b w:val="0"/>
+                <w:sz w:val="14"/>
+              </w:rPr>
+              <w:t>0.3116</w:t>
+            </w:r>
+          </w:p>
+        </w:tc>
+        <w:tc>
+          <w:tcPr>
+            <w:tcW w:type="dxa" w:w="1481"/>
+            <w:vAlign w:val="center"/>
+          </w:tcPr>
+          <w:p>
+            <w:pPr>
+              <w:jc w:val="center"/>
+            </w:pPr>
+            <w:r>
+              <w:rPr>
+                <w:b w:val="0"/>
+                <w:sz w:val="14"/>
+              </w:rPr>
+              <w:t>0.8545</w:t>
+            </w:r>
+          </w:p>
+        </w:tc>
+      </w:tr>
+      <w:tr>
+        <w:tc>
+          <w:tcPr>
+            <w:tcW w:type="dxa" w:w="1481"/>
+            <w:vAlign w:val="center"/>
+          </w:tcPr>
+          <w:p>
+            <w:pPr>
+              <w:jc w:val="center"/>
+            </w:pPr>
+            <w:r>
+              <w:rPr>
+                <w:b w:val="0"/>
+                <w:sz w:val="14"/>
+              </w:rPr>
+              <w:t>Standard</w:t>
+            </w:r>
+          </w:p>
+        </w:tc>
+        <w:tc>
+          <w:tcPr>
+            <w:tcW w:type="dxa" w:w="1481"/>
+            <w:vAlign w:val="center"/>
+          </w:tcPr>
+          <w:p>
+            <w:pPr>
+              <w:jc w:val="center"/>
+            </w:pPr>
+            <w:r>
+              <w:rPr>
+                <w:b w:val="0"/>
+                <w:sz w:val="14"/>
+              </w:rPr>
+              <w:t>Fog</w:t>
+            </w:r>
+          </w:p>
+        </w:tc>
+        <w:tc>
+          <w:tcPr>
+            <w:tcW w:type="dxa" w:w="1481"/>
+            <w:vAlign w:val="center"/>
+          </w:tcPr>
+          <w:p>
+            <w:pPr>
+              <w:jc w:val="center"/>
+            </w:pPr>
+            <w:r>
+              <w:rPr>
+                <w:b w:val="0"/>
+                <w:sz w:val="14"/>
+              </w:rPr>
+              <w:t>5</w:t>
+            </w:r>
+          </w:p>
+        </w:tc>
+        <w:tc>
+          <w:tcPr>
+            <w:tcW w:type="dxa" w:w="1481"/>
+            <w:vAlign w:val="center"/>
+          </w:tcPr>
+          <w:p>
+            <w:pPr>
+              <w:jc w:val="center"/>
+            </w:pPr>
+            <w:r>
+              <w:rPr>
+                <w:b w:val="0"/>
+                <w:sz w:val="14"/>
+              </w:rPr>
+              <w:t>0.7400</w:t>
+            </w:r>
+          </w:p>
+        </w:tc>
+        <w:tc>
+          <w:tcPr>
+            <w:tcW w:type="dxa" w:w="1481"/>
+            <w:vAlign w:val="center"/>
+          </w:tcPr>
+          <w:p>
+            <w:pPr>
+              <w:jc w:val="center"/>
+            </w:pPr>
+            <w:r>
+              <w:rPr>
+                <w:b w:val="0"/>
+                <w:sz w:val="14"/>
+              </w:rPr>
+              <w:t>0.2077</w:t>
+            </w:r>
+          </w:p>
+        </w:tc>
+        <w:tc>
+          <w:tcPr>
+            <w:tcW w:type="dxa" w:w="1481"/>
+            <w:vAlign w:val="center"/>
+          </w:tcPr>
+          <w:p>
+            <w:pPr>
+              <w:jc w:val="center"/>
+            </w:pPr>
+            <w:r>
+              <w:rPr>
+                <w:b w:val="0"/>
+                <w:sz w:val="14"/>
+              </w:rPr>
+              <w:t>0.2192</w:t>
+            </w:r>
+          </w:p>
+        </w:tc>
+        <w:tc>
+          <w:tcPr>
+            <w:tcW w:type="dxa" w:w="1481"/>
+            <w:vAlign w:val="center"/>
+          </w:tcPr>
+          <w:p>
+            <w:pPr>
+              <w:jc w:val="center"/>
+            </w:pPr>
+            <w:r>
+              <w:rPr>
+                <w:b w:val="0"/>
+                <w:sz w:val="14"/>
+              </w:rPr>
+              <w:t>0.8522</w:t>
+            </w:r>
+          </w:p>
+        </w:tc>
+      </w:tr>
+      <w:tr>
+        <w:tc>
+          <w:tcPr>
+            <w:tcW w:type="dxa" w:w="1481"/>
+            <w:vAlign w:val="center"/>
+          </w:tcPr>
+          <w:p>
+            <w:pPr>
+              <w:jc w:val="center"/>
+            </w:pPr>
+            <w:r>
+              <w:rPr>
+                <w:b w:val="0"/>
+                <w:sz w:val="14"/>
+              </w:rPr>
+              <w:t>Standard</w:t>
+            </w:r>
+          </w:p>
+        </w:tc>
+        <w:tc>
+          <w:tcPr>
+            <w:tcW w:type="dxa" w:w="1481"/>
+            <w:vAlign w:val="center"/>
+          </w:tcPr>
+          <w:p>
+            <w:pPr>
+              <w:jc w:val="center"/>
+            </w:pPr>
+            <w:r>
+              <w:rPr>
+                <w:b w:val="0"/>
+                <w:sz w:val="14"/>
+              </w:rPr>
+              <w:t>Contrast</w:t>
+            </w:r>
+          </w:p>
+        </w:tc>
+        <w:tc>
+          <w:tcPr>
+            <w:tcW w:type="dxa" w:w="1481"/>
+            <w:vAlign w:val="center"/>
+          </w:tcPr>
+          <w:p>
+            <w:pPr>
+              <w:jc w:val="center"/>
+            </w:pPr>
+            <w:r>
+              <w:rPr>
+                <w:b w:val="0"/>
+                <w:sz w:val="14"/>
+              </w:rPr>
+              <w:t>5</w:t>
+            </w:r>
+          </w:p>
+        </w:tc>
+        <w:tc>
+          <w:tcPr>
+            <w:tcW w:type="dxa" w:w="1481"/>
+            <w:vAlign w:val="center"/>
+          </w:tcPr>
+          <w:p>
+            <w:pPr>
+              <w:jc w:val="center"/>
+            </w:pPr>
+            <w:r>
+              <w:rPr>
+                <w:b w:val="0"/>
+                <w:sz w:val="14"/>
+              </w:rPr>
+              <w:t>0.5329</w:t>
+            </w:r>
+          </w:p>
+        </w:tc>
+        <w:tc>
+          <w:tcPr>
+            <w:tcW w:type="dxa" w:w="1481"/>
+            <w:vAlign w:val="center"/>
+          </w:tcPr>
+          <w:p>
+            <w:pPr>
+              <w:jc w:val="center"/>
+            </w:pPr>
+            <w:r>
+              <w:rPr>
+                <w:b w:val="0"/>
+                <w:sz w:val="14"/>
+              </w:rPr>
+              <w:t>0.4148</w:t>
+            </w:r>
+          </w:p>
+        </w:tc>
+        <w:tc>
+          <w:tcPr>
+            <w:tcW w:type="dxa" w:w="1481"/>
+            <w:vAlign w:val="center"/>
+          </w:tcPr>
+          <w:p>
+            <w:pPr>
+              <w:jc w:val="center"/>
+            </w:pPr>
+            <w:r>
+              <w:rPr>
+                <w:b w:val="0"/>
+                <w:sz w:val="14"/>
+              </w:rPr>
+              <w:t>0.4377</w:t>
+            </w:r>
+          </w:p>
+        </w:tc>
+        <w:tc>
+          <w:tcPr>
+            <w:tcW w:type="dxa" w:w="1481"/>
+            <w:vAlign w:val="center"/>
+          </w:tcPr>
+          <w:p>
+            <w:pPr>
+              <w:jc w:val="center"/>
+            </w:pPr>
+            <w:r>
+              <w:rPr>
+                <w:b w:val="0"/>
+                <w:sz w:val="14"/>
+              </w:rPr>
+              <w:t>0.8219</w:t>
+            </w:r>
+          </w:p>
+        </w:tc>
+      </w:tr>
+      <w:tr>
+        <w:tc>
+          <w:tcPr>
+            <w:tcW w:type="dxa" w:w="1481"/>
+            <w:vAlign w:val="center"/>
+          </w:tcPr>
+          <w:p>
+            <w:pPr>
+              <w:jc w:val="center"/>
+            </w:pPr>
+            <w:r>
+              <w:rPr>
+                <w:b w:val="0"/>
+                <w:sz w:val="14"/>
+              </w:rPr>
+              <w:t>Standard</w:t>
+            </w:r>
+          </w:p>
+        </w:tc>
+        <w:tc>
+          <w:tcPr>
+            <w:tcW w:type="dxa" w:w="1481"/>
+            <w:vAlign w:val="center"/>
+          </w:tcPr>
+          <w:p>
+            <w:pPr>
+              <w:jc w:val="center"/>
+            </w:pPr>
+            <w:r>
+              <w:rPr>
+                <w:b w:val="0"/>
+                <w:sz w:val="14"/>
+              </w:rPr>
+              <w:t>JPEG compression</w:t>
+            </w:r>
+          </w:p>
+        </w:tc>
+        <w:tc>
+          <w:tcPr>
+            <w:tcW w:type="dxa" w:w="1481"/>
+            <w:vAlign w:val="center"/>
+          </w:tcPr>
+          <w:p>
+            <w:pPr>
+              <w:jc w:val="center"/>
+            </w:pPr>
+            <w:r>
+              <w:rPr>
+                <w:b w:val="0"/>
+                <w:sz w:val="14"/>
+              </w:rPr>
+              <w:t>5</w:t>
+            </w:r>
+          </w:p>
+        </w:tc>
+        <w:tc>
+          <w:tcPr>
+            <w:tcW w:type="dxa" w:w="1481"/>
+            <w:vAlign w:val="center"/>
+          </w:tcPr>
+          <w:p>
+            <w:pPr>
+              <w:jc w:val="center"/>
+            </w:pPr>
+            <w:r>
+              <w:rPr>
+                <w:b w:val="0"/>
+                <w:sz w:val="14"/>
+              </w:rPr>
+              <w:t>0.6970</w:t>
+            </w:r>
+          </w:p>
+        </w:tc>
+        <w:tc>
+          <w:tcPr>
+            <w:tcW w:type="dxa" w:w="1481"/>
+            <w:vAlign w:val="center"/>
+          </w:tcPr>
+          <w:p>
+            <w:pPr>
+              <w:jc w:val="center"/>
+            </w:pPr>
+            <w:r>
+              <w:rPr>
+                <w:b w:val="0"/>
+                <w:sz w:val="14"/>
+              </w:rPr>
+              <w:t>0.2507</w:t>
+            </w:r>
+          </w:p>
+        </w:tc>
+        <w:tc>
+          <w:tcPr>
+            <w:tcW w:type="dxa" w:w="1481"/>
+            <w:vAlign w:val="center"/>
+          </w:tcPr>
+          <w:p>
+            <w:pPr>
+              <w:jc w:val="center"/>
+            </w:pPr>
+            <w:r>
+              <w:rPr>
+                <w:b w:val="0"/>
+                <w:sz w:val="14"/>
+              </w:rPr>
+              <w:t>0.2645</w:t>
+            </w:r>
+          </w:p>
+        </w:tc>
+        <w:tc>
+          <w:tcPr>
+            <w:tcW w:type="dxa" w:w="1481"/>
+            <w:vAlign w:val="center"/>
+          </w:tcPr>
+          <w:p>
+            <w:pPr>
+              <w:jc w:val="center"/>
+            </w:pPr>
+            <w:r>
+              <w:rPr>
+                <w:b w:val="0"/>
+                <w:sz w:val="14"/>
+              </w:rPr>
+              <w:t>0.8297</w:t>
+            </w:r>
+          </w:p>
+        </w:tc>
+      </w:tr>
+      <w:tr>
+        <w:tc>
+          <w:tcPr>
+            <w:tcW w:type="dxa" w:w="1481"/>
+            <w:vAlign w:val="center"/>
+          </w:tcPr>
+          <w:p>
+            <w:pPr>
+              <w:jc w:val="center"/>
+            </w:pPr>
+            <w:r>
+              <w:rPr>
+                <w:b w:val="0"/>
+                <w:sz w:val="14"/>
+              </w:rPr>
+              <w:t>Robust AugMix-WRN</w:t>
+            </w:r>
+          </w:p>
+        </w:tc>
+        <w:tc>
+          <w:tcPr>
+            <w:tcW w:type="dxa" w:w="1481"/>
+            <w:vAlign w:val="center"/>
+          </w:tcPr>
+          <w:p>
+            <w:pPr>
+              <w:jc w:val="center"/>
+            </w:pPr>
+            <w:r>
+              <w:rPr>
+                <w:b w:val="0"/>
+                <w:sz w:val="14"/>
+              </w:rPr>
+              <w:t>Gaussian noise</w:t>
+            </w:r>
+          </w:p>
+        </w:tc>
+        <w:tc>
+          <w:tcPr>
+            <w:tcW w:type="dxa" w:w="1481"/>
+            <w:vAlign w:val="center"/>
+          </w:tcPr>
+          <w:p>
+            <w:pPr>
+              <w:jc w:val="center"/>
+            </w:pPr>
+            <w:r>
+              <w:rPr>
+                <w:b w:val="0"/>
+                <w:sz w:val="14"/>
+              </w:rPr>
+              <w:t>5</w:t>
+            </w:r>
+          </w:p>
+        </w:tc>
+        <w:tc>
+          <w:tcPr>
+            <w:tcW w:type="dxa" w:w="1481"/>
+            <w:vAlign w:val="center"/>
+          </w:tcPr>
+          <w:p>
+            <w:pPr>
+              <w:jc w:val="center"/>
+            </w:pPr>
+            <w:r>
+              <w:rPr>
+                <w:b w:val="0"/>
+                <w:sz w:val="14"/>
+              </w:rPr>
+              <w:t>0.7123</w:t>
+            </w:r>
+          </w:p>
+        </w:tc>
+        <w:tc>
+          <w:tcPr>
+            <w:tcW w:type="dxa" w:w="1481"/>
+            <w:vAlign w:val="center"/>
+          </w:tcPr>
+          <w:p>
+            <w:pPr>
+              <w:jc w:val="center"/>
+            </w:pPr>
+            <w:r>
+              <w:rPr>
+                <w:b w:val="0"/>
+                <w:sz w:val="14"/>
+              </w:rPr>
+              <w:t>0.2385</w:t>
+            </w:r>
+          </w:p>
+        </w:tc>
+        <w:tc>
+          <w:tcPr>
+            <w:tcW w:type="dxa" w:w="1481"/>
+            <w:vAlign w:val="center"/>
+          </w:tcPr>
+          <w:p>
+            <w:pPr>
+              <w:jc w:val="center"/>
+            </w:pPr>
+            <w:r>
+              <w:rPr>
+                <w:b w:val="0"/>
+                <w:sz w:val="14"/>
+              </w:rPr>
+              <w:t>0.2508</w:t>
+            </w:r>
+          </w:p>
+        </w:tc>
+        <w:tc>
+          <w:tcPr>
+            <w:tcW w:type="dxa" w:w="1481"/>
+            <w:vAlign w:val="center"/>
+          </w:tcPr>
+          <w:p>
+            <w:pPr>
+              <w:jc w:val="center"/>
+            </w:pPr>
+            <w:r>
+              <w:rPr>
+                <w:b w:val="0"/>
+                <w:sz w:val="14"/>
+              </w:rPr>
+              <w:t>0.8012</w:t>
+            </w:r>
+          </w:p>
+        </w:tc>
+      </w:tr>
+      <w:tr>
+        <w:tc>
+          <w:tcPr>
+            <w:tcW w:type="dxa" w:w="1481"/>
+            <w:vAlign w:val="center"/>
+          </w:tcPr>
+          <w:p>
+            <w:pPr>
+              <w:jc w:val="center"/>
+            </w:pPr>
+            <w:r>
+              <w:rPr>
+                <w:b w:val="0"/>
+                <w:sz w:val="14"/>
+              </w:rPr>
+              <w:t>Robust AugMix-WRN</w:t>
+            </w:r>
+          </w:p>
+        </w:tc>
+        <w:tc>
+          <w:tcPr>
+            <w:tcW w:type="dxa" w:w="1481"/>
+            <w:vAlign w:val="center"/>
+          </w:tcPr>
+          <w:p>
+            <w:pPr>
+              <w:jc w:val="center"/>
+            </w:pPr>
+            <w:r>
+              <w:rPr>
+                <w:b w:val="0"/>
+                <w:sz w:val="14"/>
+              </w:rPr>
+              <w:t>Motion blur</w:t>
+            </w:r>
+          </w:p>
+        </w:tc>
+        <w:tc>
+          <w:tcPr>
+            <w:tcW w:type="dxa" w:w="1481"/>
+            <w:vAlign w:val="center"/>
+          </w:tcPr>
+          <w:p>
+            <w:pPr>
+              <w:jc w:val="center"/>
+            </w:pPr>
+            <w:r>
+              <w:rPr>
+                <w:b w:val="0"/>
+                <w:sz w:val="14"/>
+              </w:rPr>
+              <w:t>5</w:t>
+            </w:r>
+          </w:p>
+        </w:tc>
+        <w:tc>
+          <w:tcPr>
+            <w:tcW w:type="dxa" w:w="1481"/>
+            <w:vAlign w:val="center"/>
+          </w:tcPr>
+          <w:p>
+            <w:pPr>
+              <w:jc w:val="center"/>
+            </w:pPr>
+            <w:r>
+              <w:rPr>
+                <w:b w:val="0"/>
+                <w:sz w:val="14"/>
+              </w:rPr>
+              <w:t>0.8942</w:t>
+            </w:r>
+          </w:p>
+        </w:tc>
+        <w:tc>
+          <w:tcPr>
+            <w:tcW w:type="dxa" w:w="1481"/>
+            <w:vAlign w:val="center"/>
+          </w:tcPr>
+          <w:p>
+            <w:pPr>
+              <w:jc w:val="center"/>
+            </w:pPr>
+            <w:r>
+              <w:rPr>
+                <w:b w:val="0"/>
+                <w:sz w:val="14"/>
+              </w:rPr>
+              <w:t>0.0566</w:t>
+            </w:r>
+          </w:p>
+        </w:tc>
+        <w:tc>
+          <w:tcPr>
+            <w:tcW w:type="dxa" w:w="1481"/>
+            <w:vAlign w:val="center"/>
+          </w:tcPr>
+          <w:p>
+            <w:pPr>
+              <w:jc w:val="center"/>
+            </w:pPr>
+            <w:r>
+              <w:rPr>
+                <w:b w:val="0"/>
+                <w:sz w:val="14"/>
+              </w:rPr>
+              <w:t>0.0595</w:t>
+            </w:r>
+          </w:p>
+        </w:tc>
+        <w:tc>
+          <w:tcPr>
+            <w:tcW w:type="dxa" w:w="1481"/>
+            <w:vAlign w:val="center"/>
+          </w:tcPr>
+          <w:p>
+            <w:pPr>
+              <w:jc w:val="center"/>
+            </w:pPr>
+            <w:r>
+              <w:rPr>
+                <w:b w:val="0"/>
+                <w:sz w:val="14"/>
+              </w:rPr>
+              <w:t>0.7593</w:t>
+            </w:r>
+          </w:p>
+        </w:tc>
+      </w:tr>
+      <w:tr>
+        <w:tc>
+          <w:tcPr>
+            <w:tcW w:type="dxa" w:w="1481"/>
+            <w:vAlign w:val="center"/>
+          </w:tcPr>
+          <w:p>
+            <w:pPr>
+              <w:jc w:val="center"/>
+            </w:pPr>
+            <w:r>
+              <w:rPr>
+                <w:b w:val="0"/>
+                <w:sz w:val="14"/>
+              </w:rPr>
+              <w:t>Robust AugMix-WRN</w:t>
+            </w:r>
+          </w:p>
+        </w:tc>
+        <w:tc>
+          <w:tcPr>
+            <w:tcW w:type="dxa" w:w="1481"/>
+            <w:vAlign w:val="center"/>
+          </w:tcPr>
+          <w:p>
+            <w:pPr>
+              <w:jc w:val="center"/>
+            </w:pPr>
+            <w:r>
+              <w:rPr>
+                <w:b w:val="0"/>
+                <w:sz w:val="14"/>
+              </w:rPr>
+              <w:t>Fog</w:t>
+            </w:r>
+          </w:p>
+        </w:tc>
+        <w:tc>
+          <w:tcPr>
+            <w:tcW w:type="dxa" w:w="1481"/>
+            <w:vAlign w:val="center"/>
+          </w:tcPr>
+          <w:p>
+            <w:pPr>
+              <w:jc w:val="center"/>
+            </w:pPr>
+            <w:r>
+              <w:rPr>
+                <w:b w:val="0"/>
+                <w:sz w:val="14"/>
+              </w:rPr>
+              <w:t>5</w:t>
+            </w:r>
+          </w:p>
+        </w:tc>
+        <w:tc>
+          <w:tcPr>
+            <w:tcW w:type="dxa" w:w="1481"/>
+            <w:vAlign w:val="center"/>
+          </w:tcPr>
+          <w:p>
+            <w:pPr>
+              <w:jc w:val="center"/>
+            </w:pPr>
+            <w:r>
+              <w:rPr>
+                <w:b w:val="0"/>
+                <w:sz w:val="14"/>
+              </w:rPr>
+              <w:t>0.8250</w:t>
+            </w:r>
+          </w:p>
+        </w:tc>
+        <w:tc>
+          <w:tcPr>
+            <w:tcW w:type="dxa" w:w="1481"/>
+            <w:vAlign w:val="center"/>
+          </w:tcPr>
+          <w:p>
+            <w:pPr>
+              <w:jc w:val="center"/>
+            </w:pPr>
+            <w:r>
+              <w:rPr>
+                <w:b w:val="0"/>
+                <w:sz w:val="14"/>
+              </w:rPr>
+              <w:t>0.1258</w:t>
+            </w:r>
+          </w:p>
+        </w:tc>
+        <w:tc>
+          <w:tcPr>
+            <w:tcW w:type="dxa" w:w="1481"/>
+            <w:vAlign w:val="center"/>
+          </w:tcPr>
+          <w:p>
+            <w:pPr>
+              <w:jc w:val="center"/>
+            </w:pPr>
+            <w:r>
+              <w:rPr>
+                <w:b w:val="0"/>
+                <w:sz w:val="14"/>
+              </w:rPr>
+              <w:t>0.1323</w:t>
+            </w:r>
+          </w:p>
+        </w:tc>
+        <w:tc>
+          <w:tcPr>
+            <w:tcW w:type="dxa" w:w="1481"/>
+            <w:vAlign w:val="center"/>
+          </w:tcPr>
+          <w:p>
+            <w:pPr>
+              <w:jc w:val="center"/>
+            </w:pPr>
+            <w:r>
+              <w:rPr>
+                <w:b w:val="0"/>
+                <w:sz w:val="14"/>
+              </w:rPr>
+              <w:t>0.7749</w:t>
+            </w:r>
+          </w:p>
+        </w:tc>
+      </w:tr>
+      <w:tr>
+        <w:tc>
+          <w:tcPr>
+            <w:tcW w:type="dxa" w:w="1481"/>
+            <w:vAlign w:val="center"/>
+          </w:tcPr>
+          <w:p>
+            <w:pPr>
+              <w:jc w:val="center"/>
+            </w:pPr>
+            <w:r>
+              <w:rPr>
+                <w:b w:val="0"/>
+                <w:sz w:val="14"/>
+              </w:rPr>
+              <w:t>Robust AugMix-WRN</w:t>
+            </w:r>
+          </w:p>
+        </w:tc>
+        <w:tc>
+          <w:tcPr>
+            <w:tcW w:type="dxa" w:w="1481"/>
+            <w:vAlign w:val="center"/>
+          </w:tcPr>
+          <w:p>
+            <w:pPr>
+              <w:jc w:val="center"/>
+            </w:pPr>
+            <w:r>
+              <w:rPr>
+                <w:b w:val="0"/>
+                <w:sz w:val="14"/>
+              </w:rPr>
+              <w:t>Contrast</w:t>
+            </w:r>
+          </w:p>
+        </w:tc>
+        <w:tc>
+          <w:tcPr>
+            <w:tcW w:type="dxa" w:w="1481"/>
+            <w:vAlign w:val="center"/>
+          </w:tcPr>
+          <w:p>
+            <w:pPr>
+              <w:jc w:val="center"/>
+            </w:pPr>
+            <w:r>
+              <w:rPr>
+                <w:b w:val="0"/>
+                <w:sz w:val="14"/>
+              </w:rPr>
+              <w:t>5</w:t>
+            </w:r>
+          </w:p>
+        </w:tc>
+        <w:tc>
+          <w:tcPr>
+            <w:tcW w:type="dxa" w:w="1481"/>
+            <w:vAlign w:val="center"/>
+          </w:tcPr>
+          <w:p>
+            <w:pPr>
+              <w:jc w:val="center"/>
+            </w:pPr>
+            <w:r>
+              <w:rPr>
+                <w:b w:val="0"/>
+                <w:sz w:val="14"/>
+              </w:rPr>
+              <w:t>0.7905</w:t>
+            </w:r>
+          </w:p>
+        </w:tc>
+        <w:tc>
+          <w:tcPr>
+            <w:tcW w:type="dxa" w:w="1481"/>
+            <w:vAlign w:val="center"/>
+          </w:tcPr>
+          <w:p>
+            <w:pPr>
+              <w:jc w:val="center"/>
+            </w:pPr>
+            <w:r>
+              <w:rPr>
+                <w:b w:val="0"/>
+                <w:sz w:val="14"/>
+              </w:rPr>
+              <w:t>0.1603</w:t>
+            </w:r>
+          </w:p>
+        </w:tc>
+        <w:tc>
+          <w:tcPr>
+            <w:tcW w:type="dxa" w:w="1481"/>
+            <w:vAlign w:val="center"/>
+          </w:tcPr>
+          <w:p>
+            <w:pPr>
+              <w:jc w:val="center"/>
+            </w:pPr>
+            <w:r>
+              <w:rPr>
+                <w:b w:val="0"/>
+                <w:sz w:val="14"/>
+              </w:rPr>
+              <w:t>0.1686</w:t>
+            </w:r>
+          </w:p>
+        </w:tc>
+        <w:tc>
+          <w:tcPr>
+            <w:tcW w:type="dxa" w:w="1481"/>
+            <w:vAlign w:val="center"/>
+          </w:tcPr>
+          <w:p>
+            <w:pPr>
+              <w:jc w:val="center"/>
+            </w:pPr>
+            <w:r>
+              <w:rPr>
+                <w:b w:val="0"/>
+                <w:sz w:val="14"/>
+              </w:rPr>
+              <w:t>0.7362</w:t>
+            </w:r>
+          </w:p>
+        </w:tc>
+      </w:tr>
+      <w:tr>
+        <w:tc>
+          <w:tcPr>
+            <w:tcW w:type="dxa" w:w="1481"/>
+            <w:vAlign w:val="center"/>
+          </w:tcPr>
+          <w:p>
+            <w:pPr>
+              <w:jc w:val="center"/>
+            </w:pPr>
+            <w:r>
+              <w:rPr>
+                <w:b w:val="0"/>
+                <w:sz w:val="14"/>
+              </w:rPr>
+              <w:t>Robust AugMix-WRN</w:t>
+            </w:r>
+          </w:p>
+        </w:tc>
+        <w:tc>
+          <w:tcPr>
+            <w:tcW w:type="dxa" w:w="1481"/>
+            <w:vAlign w:val="center"/>
+          </w:tcPr>
+          <w:p>
+            <w:pPr>
+              <w:jc w:val="center"/>
+            </w:pPr>
+            <w:r>
+              <w:rPr>
+                <w:b w:val="0"/>
+                <w:sz w:val="14"/>
+              </w:rPr>
+              <w:t>JPEG compression</w:t>
+            </w:r>
+          </w:p>
+        </w:tc>
+        <w:tc>
+          <w:tcPr>
+            <w:tcW w:type="dxa" w:w="1481"/>
+            <w:vAlign w:val="center"/>
+          </w:tcPr>
+          <w:p>
+            <w:pPr>
+              <w:jc w:val="center"/>
+            </w:pPr>
+            <w:r>
+              <w:rPr>
+                <w:b w:val="0"/>
+                <w:sz w:val="14"/>
+              </w:rPr>
+              <w:t>5</w:t>
+            </w:r>
+          </w:p>
+        </w:tc>
+        <w:tc>
+          <w:tcPr>
+            <w:tcW w:type="dxa" w:w="1481"/>
+            <w:vAlign w:val="center"/>
+          </w:tcPr>
+          <w:p>
+            <w:pPr>
+              <w:jc w:val="center"/>
+            </w:pPr>
+            <w:r>
+              <w:rPr>
+                <w:b w:val="0"/>
+                <w:sz w:val="14"/>
+              </w:rPr>
+              <w:t>0.8532</w:t>
+            </w:r>
+          </w:p>
+        </w:tc>
+        <w:tc>
+          <w:tcPr>
+            <w:tcW w:type="dxa" w:w="1481"/>
+            <w:vAlign w:val="center"/>
+          </w:tcPr>
+          <w:p>
+            <w:pPr>
+              <w:jc w:val="center"/>
+            </w:pPr>
+            <w:r>
+              <w:rPr>
+                <w:b w:val="0"/>
+                <w:sz w:val="14"/>
+              </w:rPr>
+              <w:t>0.0976</w:t>
+            </w:r>
+          </w:p>
+        </w:tc>
+        <w:tc>
+          <w:tcPr>
+            <w:tcW w:type="dxa" w:w="1481"/>
+            <w:vAlign w:val="center"/>
+          </w:tcPr>
+          <w:p>
+            <w:pPr>
+              <w:jc w:val="center"/>
+            </w:pPr>
+            <w:r>
+              <w:rPr>
+                <w:b w:val="0"/>
+                <w:sz w:val="14"/>
+              </w:rPr>
+              <w:t>0.1027</w:t>
+            </w:r>
+          </w:p>
+        </w:tc>
+        <w:tc>
+          <w:tcPr>
+            <w:tcW w:type="dxa" w:w="1481"/>
+            <w:vAlign w:val="center"/>
+          </w:tcPr>
+          <w:p>
+            <w:pPr>
+              <w:jc w:val="center"/>
+            </w:pPr>
+            <w:r>
+              <w:rPr>
+                <w:b w:val="0"/>
+                <w:sz w:val="14"/>
+              </w:rPr>
+              <w:t>0.7411</w:t>
+            </w:r>
+          </w:p>
+        </w:tc>
+      </w:tr>
+    </w:tbl>
+    <w:p/>
+    <w:p>
+      <w:pPr>
+        <w:jc w:val="center"/>
+      </w:pPr>
+      <w:r>
+        <w:rPr>
+          <w:i/>
+          <w:sz w:val="16"/>
+        </w:rPr>
+        <w:t>附錄表 A2。Clean 與 severity 5 corruption 的主要 accuracy/drop 摘要。</w:t>
+      </w:r>
+    </w:p>
+    <w:p>
+      <w:pPr>
+        <w:pStyle w:val="21"/>
+      </w:pPr>
+      <w:r>
+        <w:t>C. TTA 與 failure overlap 摘要</w:t>
+      </w:r>
+    </w:p>
+    <w:tbl>
+      <w:tblPr>
+        <w:tblStyle w:val="aff2"/>
+        <w:tblW w:type="auto" w:w="0"/>
+        <w:jc w:val="center"/>
+        <w:tblLook w:firstColumn="1" w:firstRow="1" w:lastColumn="0" w:lastRow="0" w:noHBand="0" w:noVBand="1" w:val="04A0"/>
+      </w:tblPr>
+      <w:tblGrid>
+        <w:gridCol w:w="1481"/>
+        <w:gridCol w:w="1481"/>
+        <w:gridCol w:w="1481"/>
+        <w:gridCol w:w="1481"/>
+        <w:gridCol w:w="1481"/>
+        <w:gridCol w:w="1481"/>
+        <w:gridCol w:w="1481"/>
+      </w:tblGrid>
+      <w:tr>
+        <w:tc>
+          <w:tcPr>
+            <w:tcW w:type="dxa" w:w="1481"/>
+            <w:vAlign w:val="center"/>
+          </w:tcPr>
+          <w:p>
+            <w:pPr>
+              <w:jc w:val="center"/>
+            </w:pPr>
+            <w:r>
+              <w:rPr>
+                <w:b/>
+                <w:sz w:val="14"/>
+              </w:rPr>
+              <w:t>模型</w:t>
+            </w:r>
+          </w:p>
+        </w:tc>
+        <w:tc>
+          <w:tcPr>
+            <w:tcW w:type="dxa" w:w="1481"/>
+            <w:vAlign w:val="center"/>
+          </w:tcPr>
+          <w:p>
+            <w:pPr>
+              <w:jc w:val="center"/>
+            </w:pPr>
+            <w:r>
+              <w:rPr>
+                <w:b/>
+                <w:sz w:val="14"/>
+              </w:rPr>
+              <w:t>Clean before</w:t>
+            </w:r>
+          </w:p>
+        </w:tc>
+        <w:tc>
+          <w:tcPr>
+            <w:tcW w:type="dxa" w:w="1481"/>
+            <w:vAlign w:val="center"/>
+          </w:tcPr>
+          <w:p>
+            <w:pPr>
+              <w:jc w:val="center"/>
+            </w:pPr>
+            <w:r>
+              <w:rPr>
+                <w:b/>
+                <w:sz w:val="14"/>
+              </w:rPr>
+              <w:t>Clean after</w:t>
+            </w:r>
+          </w:p>
+        </w:tc>
+        <w:tc>
+          <w:tcPr>
+            <w:tcW w:type="dxa" w:w="1481"/>
+            <w:vAlign w:val="center"/>
+          </w:tcPr>
+          <w:p>
+            <w:pPr>
+              <w:jc w:val="center"/>
+            </w:pPr>
+            <w:r>
+              <w:rPr>
+                <w:b/>
+                <w:sz w:val="14"/>
+              </w:rPr>
+              <w:t>Delta</w:t>
+            </w:r>
+          </w:p>
+        </w:tc>
+        <w:tc>
+          <w:tcPr>
+            <w:tcW w:type="dxa" w:w="1481"/>
+            <w:vAlign w:val="center"/>
+          </w:tcPr>
+          <w:p>
+            <w:pPr>
+              <w:jc w:val="center"/>
+            </w:pPr>
+            <w:r>
+              <w:rPr>
+                <w:b/>
+                <w:sz w:val="14"/>
+              </w:rPr>
+              <w:t>Worst before</w:t>
+            </w:r>
+          </w:p>
+        </w:tc>
+        <w:tc>
+          <w:tcPr>
+            <w:tcW w:type="dxa" w:w="1481"/>
+            <w:vAlign w:val="center"/>
+          </w:tcPr>
+          <w:p>
+            <w:pPr>
+              <w:jc w:val="center"/>
+            </w:pPr>
+            <w:r>
+              <w:rPr>
+                <w:b/>
+                <w:sz w:val="14"/>
+              </w:rPr>
+              <w:t>Worst after</w:t>
+            </w:r>
+          </w:p>
+        </w:tc>
+        <w:tc>
+          <w:tcPr>
+            <w:tcW w:type="dxa" w:w="1481"/>
+            <w:vAlign w:val="center"/>
+          </w:tcPr>
+          <w:p>
+            <w:pPr>
+              <w:jc w:val="center"/>
+            </w:pPr>
+            <w:r>
+              <w:rPr>
+                <w:b/>
+                <w:sz w:val="14"/>
+              </w:rPr>
+              <w:t>Delta</w:t>
+            </w:r>
+          </w:p>
+        </w:tc>
+      </w:tr>
+      <w:tr>
+        <w:tc>
+          <w:tcPr>
+            <w:tcW w:type="dxa" w:w="1481"/>
+            <w:vAlign w:val="center"/>
+          </w:tcPr>
+          <w:p>
+            <w:pPr>
+              <w:jc w:val="center"/>
+            </w:pPr>
+            <w:r>
+              <w:rPr>
+                <w:b w:val="0"/>
+                <w:sz w:val="14"/>
+              </w:rPr>
+              <w:t>Standard</w:t>
+            </w:r>
+          </w:p>
+        </w:tc>
+        <w:tc>
+          <w:tcPr>
+            <w:tcW w:type="dxa" w:w="1481"/>
+            <w:vAlign w:val="center"/>
+          </w:tcPr>
+          <w:p>
+            <w:pPr>
+              <w:jc w:val="center"/>
+            </w:pPr>
+            <w:r>
+              <w:rPr>
+                <w:b w:val="0"/>
+                <w:sz w:val="14"/>
+              </w:rPr>
+              <w:t>0.9477</w:t>
+            </w:r>
+          </w:p>
+        </w:tc>
+        <w:tc>
+          <w:tcPr>
+            <w:tcW w:type="dxa" w:w="1481"/>
+            <w:vAlign w:val="center"/>
+          </w:tcPr>
+          <w:p>
+            <w:pPr>
+              <w:jc w:val="center"/>
+            </w:pPr>
+            <w:r>
+              <w:rPr>
+                <w:b w:val="0"/>
+                <w:sz w:val="14"/>
+              </w:rPr>
+              <w:t>0.9541</w:t>
+            </w:r>
+          </w:p>
+        </w:tc>
+        <w:tc>
+          <w:tcPr>
+            <w:tcW w:type="dxa" w:w="1481"/>
+            <w:vAlign w:val="center"/>
+          </w:tcPr>
+          <w:p>
+            <w:pPr>
+              <w:jc w:val="center"/>
+            </w:pPr>
+            <w:r>
+              <w:rPr>
+                <w:b w:val="0"/>
+                <w:sz w:val="14"/>
+              </w:rPr>
+              <w:t>+0.0064</w:t>
+            </w:r>
+          </w:p>
+        </w:tc>
+        <w:tc>
+          <w:tcPr>
+            <w:tcW w:type="dxa" w:w="1481"/>
+            <w:vAlign w:val="center"/>
+          </w:tcPr>
+          <w:p>
+            <w:pPr>
+              <w:jc w:val="center"/>
+            </w:pPr>
+            <w:r>
+              <w:rPr>
+                <w:b w:val="0"/>
+                <w:sz w:val="14"/>
+              </w:rPr>
+              <w:t>0.2768</w:t>
+            </w:r>
+          </w:p>
+        </w:tc>
+        <w:tc>
+          <w:tcPr>
+            <w:tcW w:type="dxa" w:w="1481"/>
+            <w:vAlign w:val="center"/>
+          </w:tcPr>
+          <w:p>
+            <w:pPr>
+              <w:jc w:val="center"/>
+            </w:pPr>
+            <w:r>
+              <w:rPr>
+                <w:b w:val="0"/>
+                <w:sz w:val="14"/>
+              </w:rPr>
+              <w:t>0.2789</w:t>
+            </w:r>
+          </w:p>
+        </w:tc>
+        <w:tc>
+          <w:tcPr>
+            <w:tcW w:type="dxa" w:w="1481"/>
+            <w:vAlign w:val="center"/>
+          </w:tcPr>
+          <w:p>
+            <w:pPr>
+              <w:jc w:val="center"/>
+            </w:pPr>
+            <w:r>
+              <w:rPr>
+                <w:b w:val="0"/>
+                <w:sz w:val="14"/>
+              </w:rPr>
+              <w:t>+0.0021</w:t>
+            </w:r>
+          </w:p>
+        </w:tc>
+      </w:tr>
+      <w:tr>
+        <w:tc>
+          <w:tcPr>
+            <w:tcW w:type="dxa" w:w="1481"/>
+            <w:vAlign w:val="center"/>
+          </w:tcPr>
+          <w:p>
+            <w:pPr>
+              <w:jc w:val="center"/>
+            </w:pPr>
+            <w:r>
+              <w:rPr>
+                <w:b w:val="0"/>
+                <w:sz w:val="14"/>
+              </w:rPr>
+              <w:t>Robust AugMix-WRN</w:t>
+            </w:r>
+          </w:p>
+        </w:tc>
+        <w:tc>
+          <w:tcPr>
+            <w:tcW w:type="dxa" w:w="1481"/>
+            <w:vAlign w:val="center"/>
+          </w:tcPr>
+          <w:p>
+            <w:pPr>
+              <w:jc w:val="center"/>
+            </w:pPr>
+            <w:r>
+              <w:rPr>
+                <w:b w:val="0"/>
+                <w:sz w:val="14"/>
+              </w:rPr>
+              <w:t>0.9508</w:t>
+            </w:r>
+          </w:p>
+        </w:tc>
+        <w:tc>
+          <w:tcPr>
+            <w:tcW w:type="dxa" w:w="1481"/>
+            <w:vAlign w:val="center"/>
+          </w:tcPr>
+          <w:p>
+            <w:pPr>
+              <w:jc w:val="center"/>
+            </w:pPr>
+            <w:r>
+              <w:rPr>
+                <w:b w:val="0"/>
+                <w:sz w:val="14"/>
+              </w:rPr>
+              <w:t>0.9559</w:t>
+            </w:r>
+          </w:p>
+        </w:tc>
+        <w:tc>
+          <w:tcPr>
+            <w:tcW w:type="dxa" w:w="1481"/>
+            <w:vAlign w:val="center"/>
+          </w:tcPr>
+          <w:p>
+            <w:pPr>
+              <w:jc w:val="center"/>
+            </w:pPr>
+            <w:r>
+              <w:rPr>
+                <w:b w:val="0"/>
+                <w:sz w:val="14"/>
+              </w:rPr>
+              <w:t>+0.0051</w:t>
+            </w:r>
+          </w:p>
+        </w:tc>
+        <w:tc>
+          <w:tcPr>
+            <w:tcW w:type="dxa" w:w="1481"/>
+            <w:vAlign w:val="center"/>
+          </w:tcPr>
+          <w:p>
+            <w:pPr>
+              <w:jc w:val="center"/>
+            </w:pPr>
+            <w:r>
+              <w:rPr>
+                <w:b w:val="0"/>
+                <w:sz w:val="14"/>
+              </w:rPr>
+              <w:t>0.7123</w:t>
+            </w:r>
+          </w:p>
+        </w:tc>
+        <w:tc>
+          <w:tcPr>
+            <w:tcW w:type="dxa" w:w="1481"/>
+            <w:vAlign w:val="center"/>
+          </w:tcPr>
+          <w:p>
+            <w:pPr>
+              <w:jc w:val="center"/>
+            </w:pPr>
+            <w:r>
+              <w:rPr>
+                <w:b w:val="0"/>
+                <w:sz w:val="14"/>
+              </w:rPr>
+              <w:t>0.7257</w:t>
+            </w:r>
+          </w:p>
+        </w:tc>
+        <w:tc>
+          <w:tcPr>
+            <w:tcW w:type="dxa" w:w="1481"/>
+            <w:vAlign w:val="center"/>
+          </w:tcPr>
+          <w:p>
+            <w:pPr>
+              <w:jc w:val="center"/>
+            </w:pPr>
+            <w:r>
+              <w:rPr>
+                <w:b w:val="0"/>
+                <w:sz w:val="14"/>
+              </w:rPr>
+              <w:t>+0.0134</w:t>
+            </w:r>
+          </w:p>
+        </w:tc>
+      </w:tr>
+    </w:tbl>
+    <w:p/>
+    <w:p>
+      <w:pPr>
+        <w:jc w:val="center"/>
+      </w:pPr>
+      <w:r>
+        <w:rPr>
+          <w:i/>
+          <w:sz w:val="16"/>
+        </w:rPr>
+        <w:t>附錄表 A3。Test-time augmentation 前後的 clean 與 worst-condition accuracy。</w:t>
+      </w:r>
+    </w:p>
+    <w:tbl>
+      <w:tblPr>
+        <w:tblStyle w:val="aff2"/>
+        <w:tblW w:type="auto" w:w="0"/>
+        <w:jc w:val="center"/>
+        <w:tblLook w:firstColumn="1" w:firstRow="1" w:lastColumn="0" w:lastRow="0" w:noHBand="0" w:noVBand="1" w:val="04A0"/>
+      </w:tblPr>
+      <w:tblGrid>
+        <w:gridCol w:w="2592"/>
+        <w:gridCol w:w="2592"/>
+        <w:gridCol w:w="2592"/>
+        <w:gridCol w:w="2592"/>
+      </w:tblGrid>
+      <w:tr>
+        <w:tc>
+          <w:tcPr>
+            <w:tcW w:type="dxa" w:w="2592"/>
+            <w:vAlign w:val="center"/>
+          </w:tcPr>
+          <w:p>
+            <w:pPr>
+              <w:jc w:val="center"/>
+            </w:pPr>
+            <w:r>
+              <w:rPr>
+                <w:b/>
+                <w:sz w:val="15"/>
+              </w:rPr>
+              <w:t>Severity</w:t>
+            </w:r>
+          </w:p>
+        </w:tc>
+        <w:tc>
+          <w:tcPr>
+            <w:tcW w:type="dxa" w:w="2592"/>
+            <w:vAlign w:val="center"/>
+          </w:tcPr>
+          <w:p>
+            <w:pPr>
+              <w:jc w:val="center"/>
+            </w:pPr>
+            <w:r>
+              <w:rPr>
+                <w:b/>
+                <w:sz w:val="15"/>
+              </w:rPr>
+              <w:t>Mean overlap/all</w:t>
+            </w:r>
+          </w:p>
+        </w:tc>
+        <w:tc>
+          <w:tcPr>
+            <w:tcW w:type="dxa" w:w="2592"/>
+            <w:vAlign w:val="center"/>
+          </w:tcPr>
+          <w:p>
+            <w:pPr>
+              <w:jc w:val="center"/>
+            </w:pPr>
+            <w:r>
+              <w:rPr>
+                <w:b/>
+                <w:sz w:val="15"/>
+              </w:rPr>
+              <w:t>Mean overlap/error union</w:t>
+            </w:r>
+          </w:p>
+        </w:tc>
+        <w:tc>
+          <w:tcPr>
+            <w:tcW w:type="dxa" w:w="2592"/>
+            <w:vAlign w:val="center"/>
+          </w:tcPr>
+          <w:p>
+            <w:pPr>
+              <w:jc w:val="center"/>
+            </w:pPr>
+            <w:r>
+              <w:rPr>
+                <w:b/>
+                <w:sz w:val="15"/>
+              </w:rPr>
+              <w:t>說明</w:t>
+            </w:r>
+          </w:p>
+        </w:tc>
+      </w:tr>
+      <w:tr>
+        <w:tc>
+          <w:tcPr>
+            <w:tcW w:type="dxa" w:w="2592"/>
+            <w:vAlign w:val="center"/>
+          </w:tcPr>
+          <w:p>
+            <w:pPr>
+              <w:jc w:val="center"/>
+            </w:pPr>
+            <w:r>
+              <w:rPr>
+                <w:b w:val="0"/>
+                <w:sz w:val="15"/>
+              </w:rPr>
+              <w:t>1</w:t>
+            </w:r>
+          </w:p>
+        </w:tc>
+        <w:tc>
+          <w:tcPr>
+            <w:tcW w:type="dxa" w:w="2592"/>
+            <w:vAlign w:val="center"/>
+          </w:tcPr>
+          <w:p>
+            <w:pPr>
+              <w:jc w:val="center"/>
+            </w:pPr>
+            <w:r>
+              <w:rPr>
+                <w:b w:val="0"/>
+                <w:sz w:val="15"/>
+              </w:rPr>
+              <w:t>0.0421</w:t>
+            </w:r>
+          </w:p>
+        </w:tc>
+        <w:tc>
+          <w:tcPr>
+            <w:tcW w:type="dxa" w:w="2592"/>
+            <w:vAlign w:val="center"/>
+          </w:tcPr>
+          <w:p>
+            <w:pPr>
+              <w:jc w:val="center"/>
+            </w:pPr>
+            <w:r>
+              <w:rPr>
+                <w:b w:val="0"/>
+                <w:sz w:val="15"/>
+              </w:rPr>
+              <w:t>0.3182</w:t>
+            </w:r>
+          </w:p>
+        </w:tc>
+        <w:tc>
+          <w:tcPr>
+            <w:tcW w:type="dxa" w:w="2592"/>
+            <w:vAlign w:val="center"/>
+          </w:tcPr>
+          <w:p>
+            <w:pPr>
+              <w:jc w:val="center"/>
+            </w:pPr>
+            <w:r>
+              <w:rPr>
+                <w:b w:val="0"/>
+                <w:sz w:val="15"/>
+              </w:rPr>
+              <w:t>最低 severity</w:t>
+            </w:r>
+          </w:p>
+        </w:tc>
+      </w:tr>
+      <w:tr>
+        <w:tc>
+          <w:tcPr>
+            <w:tcW w:type="dxa" w:w="2592"/>
+            <w:vAlign w:val="center"/>
+          </w:tcPr>
+          <w:p>
+            <w:pPr>
+              <w:jc w:val="center"/>
+            </w:pPr>
+            <w:r>
+              <w:rPr>
+                <w:b w:val="0"/>
+                <w:sz w:val="15"/>
+              </w:rPr>
+              <w:t>3</w:t>
+            </w:r>
+          </w:p>
+        </w:tc>
+        <w:tc>
+          <w:tcPr>
+            <w:tcW w:type="dxa" w:w="2592"/>
+            <w:vAlign w:val="center"/>
+          </w:tcPr>
+          <w:p>
+            <w:pPr>
+              <w:jc w:val="center"/>
+            </w:pPr>
+            <w:r>
+              <w:rPr>
+                <w:b w:val="0"/>
+                <w:sz w:val="15"/>
+              </w:rPr>
+              <w:t>0.0830</w:t>
+            </w:r>
+          </w:p>
+        </w:tc>
+        <w:tc>
+          <w:tcPr>
+            <w:tcW w:type="dxa" w:w="2592"/>
+            <w:vAlign w:val="center"/>
+          </w:tcPr>
+          <w:p>
+            <w:pPr>
+              <w:jc w:val="center"/>
+            </w:pPr>
+            <w:r>
+              <w:rPr>
+                <w:b w:val="0"/>
+                <w:sz w:val="15"/>
+              </w:rPr>
+              <w:t>0.3086</w:t>
+            </w:r>
+          </w:p>
+        </w:tc>
+        <w:tc>
+          <w:tcPr>
+            <w:tcW w:type="dxa" w:w="2592"/>
+            <w:vAlign w:val="center"/>
+          </w:tcPr>
+          <w:p>
+            <w:pPr>
+              <w:jc w:val="center"/>
+            </w:pPr>
+            <w:r>
+              <w:rPr>
+                <w:b w:val="0"/>
+                <w:sz w:val="15"/>
+              </w:rPr>
+              <w:t>中間 severity</w:t>
+            </w:r>
+          </w:p>
+        </w:tc>
+      </w:tr>
+      <w:tr>
+        <w:tc>
+          <w:tcPr>
+            <w:tcW w:type="dxa" w:w="2592"/>
+            <w:vAlign w:val="center"/>
+          </w:tcPr>
+          <w:p>
+            <w:pPr>
+              <w:jc w:val="center"/>
+            </w:pPr>
+            <w:r>
+              <w:rPr>
+                <w:b w:val="0"/>
+                <w:sz w:val="15"/>
+              </w:rPr>
+              <w:t>5</w:t>
+            </w:r>
+          </w:p>
+        </w:tc>
+        <w:tc>
+          <w:tcPr>
+            <w:tcW w:type="dxa" w:w="2592"/>
+            <w:vAlign w:val="center"/>
+          </w:tcPr>
+          <w:p>
+            <w:pPr>
+              <w:jc w:val="center"/>
+            </w:pPr>
+            <w:r>
+              <w:rPr>
+                <w:b w:val="0"/>
+                <w:sz w:val="15"/>
+              </w:rPr>
+              <w:t>0.1527</w:t>
+            </w:r>
+          </w:p>
+        </w:tc>
+        <w:tc>
+          <w:tcPr>
+            <w:tcW w:type="dxa" w:w="2592"/>
+            <w:vAlign w:val="center"/>
+          </w:tcPr>
+          <w:p>
+            <w:pPr>
+              <w:jc w:val="center"/>
+            </w:pPr>
+            <w:r>
+              <w:rPr>
+                <w:b w:val="0"/>
+                <w:sz w:val="15"/>
+              </w:rPr>
+              <w:t>0.3350</w:t>
+            </w:r>
+          </w:p>
+        </w:tc>
+        <w:tc>
+          <w:tcPr>
+            <w:tcW w:type="dxa" w:w="2592"/>
+            <w:vAlign w:val="center"/>
+          </w:tcPr>
+          <w:p>
+            <w:pPr>
+              <w:jc w:val="center"/>
+            </w:pPr>
+            <w:r>
+              <w:rPr>
+                <w:b w:val="0"/>
+                <w:sz w:val="15"/>
+              </w:rPr>
+              <w:t>最高 severity；平均 overlap 略高於 severity 1</w:t>
+            </w:r>
+          </w:p>
+        </w:tc>
+      </w:tr>
+    </w:tbl>
+    <w:p/>
+    <w:p>
+      <w:pPr>
+        <w:jc w:val="center"/>
+      </w:pPr>
+      <w:r>
+        <w:rPr>
+          <w:i/>
+          <w:sz w:val="16"/>
+        </w:rPr>
+        <w:t>附錄表 A4。不同 severity 下的平均 failure overlap。</w:t>
+      </w:r>
+    </w:p>
+    <w:p>
+      <w:pPr>
+        <w:pStyle w:val="21"/>
+      </w:pPr>
+      <w:r>
+        <w:t>D. High-confidence failure cases</w:t>
+      </w:r>
+    </w:p>
+    <w:tbl>
+      <w:tblPr>
+        <w:tblStyle w:val="aff2"/>
+        <w:tblW w:type="auto" w:w="0"/>
+        <w:jc w:val="center"/>
+        <w:tblLook w:firstColumn="1" w:firstRow="1" w:lastColumn="0" w:lastRow="0" w:noHBand="0" w:noVBand="1" w:val="04A0"/>
+      </w:tblPr>
+      <w:tblGrid>
+        <w:gridCol w:w="1481"/>
+        <w:gridCol w:w="1481"/>
+        <w:gridCol w:w="1481"/>
+        <w:gridCol w:w="1481"/>
+        <w:gridCol w:w="1481"/>
+        <w:gridCol w:w="1481"/>
+        <w:gridCol w:w="1481"/>
+      </w:tblGrid>
+      <w:tr>
+        <w:tc>
+          <w:tcPr>
+            <w:tcW w:type="dxa" w:w="1481"/>
+            <w:vAlign w:val="center"/>
+          </w:tcPr>
+          <w:p>
+            <w:pPr>
+              <w:jc w:val="center"/>
+            </w:pPr>
+            <w:r>
+              <w:rPr>
+                <w:b/>
+                <w:sz w:val="13"/>
+              </w:rPr>
+              <w:t>模型</w:t>
+            </w:r>
+          </w:p>
+        </w:tc>
+        <w:tc>
+          <w:tcPr>
+            <w:tcW w:type="dxa" w:w="1481"/>
+            <w:vAlign w:val="center"/>
+          </w:tcPr>
+          <w:p>
+            <w:pPr>
+              <w:jc w:val="center"/>
+            </w:pPr>
+            <w:r>
+              <w:rPr>
+                <w:b/>
+                <w:sz w:val="13"/>
+              </w:rPr>
+              <w:t>Corruption</w:t>
+            </w:r>
+          </w:p>
+        </w:tc>
+        <w:tc>
+          <w:tcPr>
+            <w:tcW w:type="dxa" w:w="1481"/>
+            <w:vAlign w:val="center"/>
+          </w:tcPr>
+          <w:p>
+            <w:pPr>
+              <w:jc w:val="center"/>
+            </w:pPr>
+            <w:r>
+              <w:rPr>
+                <w:b/>
+                <w:sz w:val="13"/>
+              </w:rPr>
+              <w:t>Severity</w:t>
+            </w:r>
+          </w:p>
+        </w:tc>
+        <w:tc>
+          <w:tcPr>
+            <w:tcW w:type="dxa" w:w="1481"/>
+            <w:vAlign w:val="center"/>
+          </w:tcPr>
+          <w:p>
+            <w:pPr>
+              <w:jc w:val="center"/>
+            </w:pPr>
+            <w:r>
+              <w:rPr>
+                <w:b/>
+                <w:sz w:val="13"/>
+              </w:rPr>
+              <w:t>True label</w:t>
+            </w:r>
+          </w:p>
+        </w:tc>
+        <w:tc>
+          <w:tcPr>
+            <w:tcW w:type="dxa" w:w="1481"/>
+            <w:vAlign w:val="center"/>
+          </w:tcPr>
+          <w:p>
+            <w:pPr>
+              <w:jc w:val="center"/>
+            </w:pPr>
+            <w:r>
+              <w:rPr>
+                <w:b/>
+                <w:sz w:val="13"/>
+              </w:rPr>
+              <w:t>Pred label</w:t>
+            </w:r>
+          </w:p>
+        </w:tc>
+        <w:tc>
+          <w:tcPr>
+            <w:tcW w:type="dxa" w:w="1481"/>
+            <w:vAlign w:val="center"/>
+          </w:tcPr>
+          <w:p>
+            <w:pPr>
+              <w:jc w:val="center"/>
+            </w:pPr>
+            <w:r>
+              <w:rPr>
+                <w:b/>
+                <w:sz w:val="13"/>
+              </w:rPr>
+              <w:t>Confidence</w:t>
+            </w:r>
+          </w:p>
+        </w:tc>
+        <w:tc>
+          <w:tcPr>
+            <w:tcW w:type="dxa" w:w="1481"/>
+            <w:vAlign w:val="center"/>
+          </w:tcPr>
+          <w:p>
+            <w:pPr>
+              <w:jc w:val="center"/>
+            </w:pPr>
+            <w:r>
+              <w:rPr>
+                <w:b/>
+                <w:sz w:val="13"/>
+              </w:rPr>
+              <w:t>Entropy</w:t>
+            </w:r>
+          </w:p>
+        </w:tc>
+      </w:tr>
+      <w:tr>
+        <w:tc>
+          <w:tcPr>
+            <w:tcW w:type="dxa" w:w="1481"/>
+            <w:vAlign w:val="center"/>
+          </w:tcPr>
+          <w:p>
+            <w:pPr>
+              <w:jc w:val="center"/>
+            </w:pPr>
+            <w:r>
+              <w:rPr>
+                <w:b w:val="0"/>
+                <w:sz w:val="13"/>
+              </w:rPr>
+              <w:t>Robust AugMix-WRN</w:t>
+            </w:r>
+          </w:p>
+        </w:tc>
+        <w:tc>
+          <w:tcPr>
+            <w:tcW w:type="dxa" w:w="1481"/>
+            <w:vAlign w:val="center"/>
+          </w:tcPr>
+          <w:p>
+            <w:pPr>
+              <w:jc w:val="center"/>
+            </w:pPr>
+            <w:r>
+              <w:rPr>
+                <w:b w:val="0"/>
+                <w:sz w:val="13"/>
+              </w:rPr>
+              <w:t>Gaussian noise</w:t>
+            </w:r>
+          </w:p>
+        </w:tc>
+        <w:tc>
+          <w:tcPr>
+            <w:tcW w:type="dxa" w:w="1481"/>
+            <w:vAlign w:val="center"/>
+          </w:tcPr>
+          <w:p>
+            <w:pPr>
+              <w:jc w:val="center"/>
+            </w:pPr>
+            <w:r>
+              <w:rPr>
+                <w:b w:val="0"/>
+                <w:sz w:val="13"/>
+              </w:rPr>
+              <w:t>5</w:t>
+            </w:r>
+          </w:p>
+        </w:tc>
+        <w:tc>
+          <w:tcPr>
+            <w:tcW w:type="dxa" w:w="1481"/>
+            <w:vAlign w:val="center"/>
+          </w:tcPr>
+          <w:p>
+            <w:pPr>
+              <w:jc w:val="center"/>
+            </w:pPr>
+            <w:r>
+              <w:rPr>
+                <w:b w:val="0"/>
+                <w:sz w:val="13"/>
+              </w:rPr>
+              <w:t>0 airplane</w:t>
+            </w:r>
+          </w:p>
+        </w:tc>
+        <w:tc>
+          <w:tcPr>
+            <w:tcW w:type="dxa" w:w="1481"/>
+            <w:vAlign w:val="center"/>
+          </w:tcPr>
+          <w:p>
+            <w:pPr>
+              <w:jc w:val="center"/>
+            </w:pPr>
+            <w:r>
+              <w:rPr>
+                <w:b w:val="0"/>
+                <w:sz w:val="13"/>
+              </w:rPr>
+              <w:t>6 frog</w:t>
+            </w:r>
+          </w:p>
+        </w:tc>
+        <w:tc>
+          <w:tcPr>
+            <w:tcW w:type="dxa" w:w="1481"/>
+            <w:vAlign w:val="center"/>
+          </w:tcPr>
+          <w:p>
+            <w:pPr>
+              <w:jc w:val="center"/>
+            </w:pPr>
+            <w:r>
+              <w:rPr>
+                <w:b w:val="0"/>
+                <w:sz w:val="13"/>
+              </w:rPr>
+              <w:t>1.0000</w:t>
+            </w:r>
+          </w:p>
+        </w:tc>
+        <w:tc>
+          <w:tcPr>
+            <w:tcW w:type="dxa" w:w="1481"/>
+            <w:vAlign w:val="center"/>
+          </w:tcPr>
+          <w:p>
+            <w:pPr>
+              <w:jc w:val="center"/>
+            </w:pPr>
+            <w:r>
+              <w:rPr>
+                <w:b w:val="0"/>
+                <w:sz w:val="13"/>
+              </w:rPr>
+              <w:t>1.64e-04</w:t>
+            </w:r>
+          </w:p>
+        </w:tc>
+      </w:tr>
+      <w:tr>
+        <w:tc>
+          <w:tcPr>
+            <w:tcW w:type="dxa" w:w="1481"/>
+            <w:vAlign w:val="center"/>
+          </w:tcPr>
+          <w:p>
+            <w:pPr>
+              <w:jc w:val="center"/>
+            </w:pPr>
+            <w:r>
+              <w:rPr>
+                <w:b w:val="0"/>
+                <w:sz w:val="13"/>
+              </w:rPr>
+              <w:t>Robust AugMix-WRN</w:t>
+            </w:r>
+          </w:p>
+        </w:tc>
+        <w:tc>
+          <w:tcPr>
+            <w:tcW w:type="dxa" w:w="1481"/>
+            <w:vAlign w:val="center"/>
+          </w:tcPr>
+          <w:p>
+            <w:pPr>
+              <w:jc w:val="center"/>
+            </w:pPr>
+            <w:r>
+              <w:rPr>
+                <w:b w:val="0"/>
+                <w:sz w:val="13"/>
+              </w:rPr>
+              <w:t>Gaussian noise</w:t>
+            </w:r>
+          </w:p>
+        </w:tc>
+        <w:tc>
+          <w:tcPr>
+            <w:tcW w:type="dxa" w:w="1481"/>
+            <w:vAlign w:val="center"/>
+          </w:tcPr>
+          <w:p>
+            <w:pPr>
+              <w:jc w:val="center"/>
+            </w:pPr>
+            <w:r>
+              <w:rPr>
+                <w:b w:val="0"/>
+                <w:sz w:val="13"/>
+              </w:rPr>
+              <w:t>3</w:t>
+            </w:r>
+          </w:p>
+        </w:tc>
+        <w:tc>
+          <w:tcPr>
+            <w:tcW w:type="dxa" w:w="1481"/>
+            <w:vAlign w:val="center"/>
+          </w:tcPr>
+          <w:p>
+            <w:pPr>
+              <w:jc w:val="center"/>
+            </w:pPr>
+            <w:r>
+              <w:rPr>
+                <w:b w:val="0"/>
+                <w:sz w:val="13"/>
+              </w:rPr>
+              <w:t>1 automobile</w:t>
+            </w:r>
+          </w:p>
+        </w:tc>
+        <w:tc>
+          <w:tcPr>
+            <w:tcW w:type="dxa" w:w="1481"/>
+            <w:vAlign w:val="center"/>
+          </w:tcPr>
+          <w:p>
+            <w:pPr>
+              <w:jc w:val="center"/>
+            </w:pPr>
+            <w:r>
+              <w:rPr>
+                <w:b w:val="0"/>
+                <w:sz w:val="13"/>
+              </w:rPr>
+              <w:t>6 frog</w:t>
+            </w:r>
+          </w:p>
+        </w:tc>
+        <w:tc>
+          <w:tcPr>
+            <w:tcW w:type="dxa" w:w="1481"/>
+            <w:vAlign w:val="center"/>
+          </w:tcPr>
+          <w:p>
+            <w:pPr>
+              <w:jc w:val="center"/>
+            </w:pPr>
+            <w:r>
+              <w:rPr>
+                <w:b w:val="0"/>
+                <w:sz w:val="13"/>
+              </w:rPr>
+              <w:t>1.0000</w:t>
+            </w:r>
+          </w:p>
+        </w:tc>
+        <w:tc>
+          <w:tcPr>
+            <w:tcW w:type="dxa" w:w="1481"/>
+            <w:vAlign w:val="center"/>
+          </w:tcPr>
+          <w:p>
+            <w:pPr>
+              <w:jc w:val="center"/>
+            </w:pPr>
+            <w:r>
+              <w:rPr>
+                <w:b w:val="0"/>
+                <w:sz w:val="13"/>
+              </w:rPr>
+              <w:t>1.93e-04</w:t>
+            </w:r>
+          </w:p>
+        </w:tc>
+      </w:tr>
+      <w:tr>
+        <w:tc>
+          <w:tcPr>
+            <w:tcW w:type="dxa" w:w="1481"/>
+            <w:vAlign w:val="center"/>
+          </w:tcPr>
+          <w:p>
+            <w:pPr>
+              <w:jc w:val="center"/>
+            </w:pPr>
+            <w:r>
+              <w:rPr>
+                <w:b w:val="0"/>
+                <w:sz w:val="13"/>
+              </w:rPr>
+              <w:t>Robust AugMix-WRN</w:t>
+            </w:r>
+          </w:p>
+        </w:tc>
+        <w:tc>
+          <w:tcPr>
+            <w:tcW w:type="dxa" w:w="1481"/>
+            <w:vAlign w:val="center"/>
+          </w:tcPr>
+          <w:p>
+            <w:pPr>
+              <w:jc w:val="center"/>
+            </w:pPr>
+            <w:r>
+              <w:rPr>
+                <w:b w:val="0"/>
+                <w:sz w:val="13"/>
+              </w:rPr>
+              <w:t>Gaussian noise</w:t>
+            </w:r>
+          </w:p>
+        </w:tc>
+        <w:tc>
+          <w:tcPr>
+            <w:tcW w:type="dxa" w:w="1481"/>
+            <w:vAlign w:val="center"/>
+          </w:tcPr>
+          <w:p>
+            <w:pPr>
+              <w:jc w:val="center"/>
+            </w:pPr>
+            <w:r>
+              <w:rPr>
+                <w:b w:val="0"/>
+                <w:sz w:val="13"/>
+              </w:rPr>
+              <w:t>5</w:t>
+            </w:r>
+          </w:p>
+        </w:tc>
+        <w:tc>
+          <w:tcPr>
+            <w:tcW w:type="dxa" w:w="1481"/>
+            <w:vAlign w:val="center"/>
+          </w:tcPr>
+          <w:p>
+            <w:pPr>
+              <w:jc w:val="center"/>
+            </w:pPr>
+            <w:r>
+              <w:rPr>
+                <w:b w:val="0"/>
+                <w:sz w:val="13"/>
+              </w:rPr>
+              <w:t>3 cat</w:t>
+            </w:r>
+          </w:p>
+        </w:tc>
+        <w:tc>
+          <w:tcPr>
+            <w:tcW w:type="dxa" w:w="1481"/>
+            <w:vAlign w:val="center"/>
+          </w:tcPr>
+          <w:p>
+            <w:pPr>
+              <w:jc w:val="center"/>
+            </w:pPr>
+            <w:r>
+              <w:rPr>
+                <w:b w:val="0"/>
+                <w:sz w:val="13"/>
+              </w:rPr>
+              <w:t>6 frog</w:t>
+            </w:r>
+          </w:p>
+        </w:tc>
+        <w:tc>
+          <w:tcPr>
+            <w:tcW w:type="dxa" w:w="1481"/>
+            <w:vAlign w:val="center"/>
+          </w:tcPr>
+          <w:p>
+            <w:pPr>
+              <w:jc w:val="center"/>
+            </w:pPr>
+            <w:r>
+              <w:rPr>
+                <w:b w:val="0"/>
+                <w:sz w:val="13"/>
+              </w:rPr>
+              <w:t>1.0000</w:t>
+            </w:r>
+          </w:p>
+        </w:tc>
+        <w:tc>
+          <w:tcPr>
+            <w:tcW w:type="dxa" w:w="1481"/>
+            <w:vAlign w:val="center"/>
+          </w:tcPr>
+          <w:p>
+            <w:pPr>
+              <w:jc w:val="center"/>
+            </w:pPr>
+            <w:r>
+              <w:rPr>
+                <w:b w:val="0"/>
+                <w:sz w:val="13"/>
+              </w:rPr>
+              <w:t>1.94e-04</w:t>
+            </w:r>
+          </w:p>
+        </w:tc>
+      </w:tr>
+      <w:tr>
+        <w:tc>
+          <w:tcPr>
+            <w:tcW w:type="dxa" w:w="1481"/>
+            <w:vAlign w:val="center"/>
+          </w:tcPr>
+          <w:p>
+            <w:pPr>
+              <w:jc w:val="center"/>
+            </w:pPr>
+            <w:r>
+              <w:rPr>
+                <w:b w:val="0"/>
+                <w:sz w:val="13"/>
+              </w:rPr>
+              <w:t>Robust AugMix-WRN</w:t>
+            </w:r>
+          </w:p>
+        </w:tc>
+        <w:tc>
+          <w:tcPr>
+            <w:tcW w:type="dxa" w:w="1481"/>
+            <w:vAlign w:val="center"/>
+          </w:tcPr>
+          <w:p>
+            <w:pPr>
+              <w:jc w:val="center"/>
+            </w:pPr>
+            <w:r>
+              <w:rPr>
+                <w:b w:val="0"/>
+                <w:sz w:val="13"/>
+              </w:rPr>
+              <w:t>Gaussian noise</w:t>
+            </w:r>
+          </w:p>
+        </w:tc>
+        <w:tc>
+          <w:tcPr>
+            <w:tcW w:type="dxa" w:w="1481"/>
+            <w:vAlign w:val="center"/>
+          </w:tcPr>
+          <w:p>
+            <w:pPr>
+              <w:jc w:val="center"/>
+            </w:pPr>
+            <w:r>
+              <w:rPr>
+                <w:b w:val="0"/>
+                <w:sz w:val="13"/>
+              </w:rPr>
+              <w:t>5</w:t>
+            </w:r>
+          </w:p>
+        </w:tc>
+        <w:tc>
+          <w:tcPr>
+            <w:tcW w:type="dxa" w:w="1481"/>
+            <w:vAlign w:val="center"/>
+          </w:tcPr>
+          <w:p>
+            <w:pPr>
+              <w:jc w:val="center"/>
+            </w:pPr>
+            <w:r>
+              <w:rPr>
+                <w:b w:val="0"/>
+                <w:sz w:val="13"/>
+              </w:rPr>
+              <w:t>9 truck</w:t>
+            </w:r>
+          </w:p>
+        </w:tc>
+        <w:tc>
+          <w:tcPr>
+            <w:tcW w:type="dxa" w:w="1481"/>
+            <w:vAlign w:val="center"/>
+          </w:tcPr>
+          <w:p>
+            <w:pPr>
+              <w:jc w:val="center"/>
+            </w:pPr>
+            <w:r>
+              <w:rPr>
+                <w:b w:val="0"/>
+                <w:sz w:val="13"/>
+              </w:rPr>
+              <w:t>6 frog</w:t>
+            </w:r>
+          </w:p>
+        </w:tc>
+        <w:tc>
+          <w:tcPr>
+            <w:tcW w:type="dxa" w:w="1481"/>
+            <w:vAlign w:val="center"/>
+          </w:tcPr>
+          <w:p>
+            <w:pPr>
+              <w:jc w:val="center"/>
+            </w:pPr>
+            <w:r>
+              <w:rPr>
+                <w:b w:val="0"/>
+                <w:sz w:val="13"/>
+              </w:rPr>
+              <w:t>1.0000</w:t>
+            </w:r>
+          </w:p>
+        </w:tc>
+        <w:tc>
+          <w:tcPr>
+            <w:tcW w:type="dxa" w:w="1481"/>
+            <w:vAlign w:val="center"/>
+          </w:tcPr>
+          <w:p>
+            <w:pPr>
+              <w:jc w:val="center"/>
+            </w:pPr>
+            <w:r>
+              <w:rPr>
+                <w:b w:val="0"/>
+                <w:sz w:val="13"/>
+              </w:rPr>
+              <w:t>2.08e-04</w:t>
+            </w:r>
+          </w:p>
+        </w:tc>
+      </w:tr>
+      <w:tr>
+        <w:tc>
+          <w:tcPr>
+            <w:tcW w:type="dxa" w:w="1481"/>
+            <w:vAlign w:val="center"/>
+          </w:tcPr>
+          <w:p>
+            <w:pPr>
+              <w:jc w:val="center"/>
+            </w:pPr>
+            <w:r>
+              <w:rPr>
+                <w:b w:val="0"/>
+                <w:sz w:val="13"/>
+              </w:rPr>
+              <w:t>Robust AugMix-WRN</w:t>
+            </w:r>
+          </w:p>
+        </w:tc>
+        <w:tc>
+          <w:tcPr>
+            <w:tcW w:type="dxa" w:w="1481"/>
+            <w:vAlign w:val="center"/>
+          </w:tcPr>
+          <w:p>
+            <w:pPr>
+              <w:jc w:val="center"/>
+            </w:pPr>
+            <w:r>
+              <w:rPr>
+                <w:b w:val="0"/>
+                <w:sz w:val="13"/>
+              </w:rPr>
+              <w:t>Gaussian noise</w:t>
+            </w:r>
+          </w:p>
+        </w:tc>
+        <w:tc>
+          <w:tcPr>
+            <w:tcW w:type="dxa" w:w="1481"/>
+            <w:vAlign w:val="center"/>
+          </w:tcPr>
+          <w:p>
+            <w:pPr>
+              <w:jc w:val="center"/>
+            </w:pPr>
+            <w:r>
+              <w:rPr>
+                <w:b w:val="0"/>
+                <w:sz w:val="13"/>
+              </w:rPr>
+              <w:t>5</w:t>
+            </w:r>
+          </w:p>
+        </w:tc>
+        <w:tc>
+          <w:tcPr>
+            <w:tcW w:type="dxa" w:w="1481"/>
+            <w:vAlign w:val="center"/>
+          </w:tcPr>
+          <w:p>
+            <w:pPr>
+              <w:jc w:val="center"/>
+            </w:pPr>
+            <w:r>
+              <w:rPr>
+                <w:b w:val="0"/>
+                <w:sz w:val="13"/>
+              </w:rPr>
+              <w:t>5 dog</w:t>
+            </w:r>
+          </w:p>
+        </w:tc>
+        <w:tc>
+          <w:tcPr>
+            <w:tcW w:type="dxa" w:w="1481"/>
+            <w:vAlign w:val="center"/>
+          </w:tcPr>
+          <w:p>
+            <w:pPr>
+              <w:jc w:val="center"/>
+            </w:pPr>
+            <w:r>
+              <w:rPr>
+                <w:b w:val="0"/>
+                <w:sz w:val="13"/>
+              </w:rPr>
+              <w:t>6 frog</w:t>
+            </w:r>
+          </w:p>
+        </w:tc>
+        <w:tc>
+          <w:tcPr>
+            <w:tcW w:type="dxa" w:w="1481"/>
+            <w:vAlign w:val="center"/>
+          </w:tcPr>
+          <w:p>
+            <w:pPr>
+              <w:jc w:val="center"/>
+            </w:pPr>
+            <w:r>
+              <w:rPr>
+                <w:b w:val="0"/>
+                <w:sz w:val="13"/>
+              </w:rPr>
+              <w:t>1.0000</w:t>
+            </w:r>
+          </w:p>
+        </w:tc>
+        <w:tc>
+          <w:tcPr>
+            <w:tcW w:type="dxa" w:w="1481"/>
+            <w:vAlign w:val="center"/>
+          </w:tcPr>
+          <w:p>
+            <w:pPr>
+              <w:jc w:val="center"/>
+            </w:pPr>
+            <w:r>
+              <w:rPr>
+                <w:b w:val="0"/>
+                <w:sz w:val="13"/>
+              </w:rPr>
+              <w:t>2.51e-04</w:t>
+            </w:r>
+          </w:p>
+        </w:tc>
+      </w:tr>
+      <w:tr>
+        <w:tc>
+          <w:tcPr>
+            <w:tcW w:type="dxa" w:w="1481"/>
+            <w:vAlign w:val="center"/>
+          </w:tcPr>
+          <w:p>
+            <w:pPr>
+              <w:jc w:val="center"/>
+            </w:pPr>
+            <w:r>
+              <w:rPr>
+                <w:b w:val="0"/>
+                <w:sz w:val="13"/>
+              </w:rPr>
+              <w:t>Standard</w:t>
+            </w:r>
+          </w:p>
+        </w:tc>
+        <w:tc>
+          <w:tcPr>
+            <w:tcW w:type="dxa" w:w="1481"/>
+            <w:vAlign w:val="center"/>
+          </w:tcPr>
+          <w:p>
+            <w:pPr>
+              <w:jc w:val="center"/>
+            </w:pPr>
+            <w:r>
+              <w:rPr>
+                <w:b w:val="0"/>
+                <w:sz w:val="13"/>
+              </w:rPr>
+              <w:t>Motion blur</w:t>
+            </w:r>
+          </w:p>
+        </w:tc>
+        <w:tc>
+          <w:tcPr>
+            <w:tcW w:type="dxa" w:w="1481"/>
+            <w:vAlign w:val="center"/>
+          </w:tcPr>
+          <w:p>
+            <w:pPr>
+              <w:jc w:val="center"/>
+            </w:pPr>
+            <w:r>
+              <w:rPr>
+                <w:b w:val="0"/>
+                <w:sz w:val="13"/>
+              </w:rPr>
+              <w:t>3</w:t>
+            </w:r>
+          </w:p>
+        </w:tc>
+        <w:tc>
+          <w:tcPr>
+            <w:tcW w:type="dxa" w:w="1481"/>
+            <w:vAlign w:val="center"/>
+          </w:tcPr>
+          <w:p>
+            <w:pPr>
+              <w:jc w:val="center"/>
+            </w:pPr>
+            <w:r>
+              <w:rPr>
+                <w:b w:val="0"/>
+                <w:sz w:val="13"/>
+              </w:rPr>
+              <w:t>5 dog</w:t>
+            </w:r>
+          </w:p>
+        </w:tc>
+        <w:tc>
+          <w:tcPr>
+            <w:tcW w:type="dxa" w:w="1481"/>
+            <w:vAlign w:val="center"/>
+          </w:tcPr>
+          <w:p>
+            <w:pPr>
+              <w:jc w:val="center"/>
+            </w:pPr>
+            <w:r>
+              <w:rPr>
+                <w:b w:val="0"/>
+                <w:sz w:val="13"/>
+              </w:rPr>
+              <w:t>3 cat</w:t>
+            </w:r>
+          </w:p>
+        </w:tc>
+        <w:tc>
+          <w:tcPr>
+            <w:tcW w:type="dxa" w:w="1481"/>
+            <w:vAlign w:val="center"/>
+          </w:tcPr>
+          <w:p>
+            <w:pPr>
+              <w:jc w:val="center"/>
+            </w:pPr>
+            <w:r>
+              <w:rPr>
+                <w:b w:val="0"/>
+                <w:sz w:val="13"/>
+              </w:rPr>
+              <w:t>1.0000</w:t>
+            </w:r>
+          </w:p>
+        </w:tc>
+        <w:tc>
+          <w:tcPr>
+            <w:tcW w:type="dxa" w:w="1481"/>
+            <w:vAlign w:val="center"/>
+          </w:tcPr>
+          <w:p>
+            <w:pPr>
+              <w:jc w:val="center"/>
+            </w:pPr>
+            <w:r>
+              <w:rPr>
+                <w:b w:val="0"/>
+                <w:sz w:val="13"/>
+              </w:rPr>
+              <w:t>2.92e-07</w:t>
+            </w:r>
+          </w:p>
+        </w:tc>
+      </w:tr>
+      <w:tr>
+        <w:tc>
+          <w:tcPr>
+            <w:tcW w:type="dxa" w:w="1481"/>
+            <w:vAlign w:val="center"/>
+          </w:tcPr>
+          <w:p>
+            <w:pPr>
+              <w:jc w:val="center"/>
+            </w:pPr>
+            <w:r>
+              <w:rPr>
+                <w:b w:val="0"/>
+                <w:sz w:val="13"/>
+              </w:rPr>
+              <w:t>Standard</w:t>
+            </w:r>
+          </w:p>
+        </w:tc>
+        <w:tc>
+          <w:tcPr>
+            <w:tcW w:type="dxa" w:w="1481"/>
+            <w:vAlign w:val="center"/>
+          </w:tcPr>
+          <w:p>
+            <w:pPr>
+              <w:jc w:val="center"/>
+            </w:pPr>
+            <w:r>
+              <w:rPr>
+                <w:b w:val="0"/>
+                <w:sz w:val="13"/>
+              </w:rPr>
+              <w:t>Motion blur</w:t>
+            </w:r>
+          </w:p>
+        </w:tc>
+        <w:tc>
+          <w:tcPr>
+            <w:tcW w:type="dxa" w:w="1481"/>
+            <w:vAlign w:val="center"/>
+          </w:tcPr>
+          <w:p>
+            <w:pPr>
+              <w:jc w:val="center"/>
+            </w:pPr>
+            <w:r>
+              <w:rPr>
+                <w:b w:val="0"/>
+                <w:sz w:val="13"/>
+              </w:rPr>
+              <w:t>3</w:t>
+            </w:r>
+          </w:p>
+        </w:tc>
+        <w:tc>
+          <w:tcPr>
+            <w:tcW w:type="dxa" w:w="1481"/>
+            <w:vAlign w:val="center"/>
+          </w:tcPr>
+          <w:p>
+            <w:pPr>
+              <w:jc w:val="center"/>
+            </w:pPr>
+            <w:r>
+              <w:rPr>
+                <w:b w:val="0"/>
+                <w:sz w:val="13"/>
+              </w:rPr>
+              <w:t>6 frog</w:t>
+            </w:r>
+          </w:p>
+        </w:tc>
+        <w:tc>
+          <w:tcPr>
+            <w:tcW w:type="dxa" w:w="1481"/>
+            <w:vAlign w:val="center"/>
+          </w:tcPr>
+          <w:p>
+            <w:pPr>
+              <w:jc w:val="center"/>
+            </w:pPr>
+            <w:r>
+              <w:rPr>
+                <w:b w:val="0"/>
+                <w:sz w:val="13"/>
+              </w:rPr>
+              <w:t>3 cat</w:t>
+            </w:r>
+          </w:p>
+        </w:tc>
+        <w:tc>
+          <w:tcPr>
+            <w:tcW w:type="dxa" w:w="1481"/>
+            <w:vAlign w:val="center"/>
+          </w:tcPr>
+          <w:p>
+            <w:pPr>
+              <w:jc w:val="center"/>
+            </w:pPr>
+            <w:r>
+              <w:rPr>
+                <w:b w:val="0"/>
+                <w:sz w:val="13"/>
+              </w:rPr>
+              <w:t>1.0000</w:t>
+            </w:r>
+          </w:p>
+        </w:tc>
+        <w:tc>
+          <w:tcPr>
+            <w:tcW w:type="dxa" w:w="1481"/>
+            <w:vAlign w:val="center"/>
+          </w:tcPr>
+          <w:p>
+            <w:pPr>
+              <w:jc w:val="center"/>
+            </w:pPr>
+            <w:r>
+              <w:rPr>
+                <w:b w:val="0"/>
+                <w:sz w:val="13"/>
+              </w:rPr>
+              <w:t>4.55e-07</w:t>
+            </w:r>
+          </w:p>
+        </w:tc>
+      </w:tr>
+      <w:tr>
+        <w:tc>
+          <w:tcPr>
+            <w:tcW w:type="dxa" w:w="1481"/>
+            <w:vAlign w:val="center"/>
+          </w:tcPr>
+          <w:p>
+            <w:pPr>
+              <w:jc w:val="center"/>
+            </w:pPr>
+            <w:r>
+              <w:rPr>
+                <w:b w:val="0"/>
+                <w:sz w:val="13"/>
+              </w:rPr>
+              <w:t>Standard</w:t>
+            </w:r>
+          </w:p>
+        </w:tc>
+        <w:tc>
+          <w:tcPr>
+            <w:tcW w:type="dxa" w:w="1481"/>
+            <w:vAlign w:val="center"/>
+          </w:tcPr>
+          <w:p>
+            <w:pPr>
+              <w:jc w:val="center"/>
+            </w:pPr>
+            <w:r>
+              <w:rPr>
+                <w:b w:val="0"/>
+                <w:sz w:val="13"/>
+              </w:rPr>
+              <w:t>Motion blur</w:t>
+            </w:r>
+          </w:p>
+        </w:tc>
+        <w:tc>
+          <w:tcPr>
+            <w:tcW w:type="dxa" w:w="1481"/>
+            <w:vAlign w:val="center"/>
+          </w:tcPr>
+          <w:p>
+            <w:pPr>
+              <w:jc w:val="center"/>
+            </w:pPr>
+            <w:r>
+              <w:rPr>
+                <w:b w:val="0"/>
+                <w:sz w:val="13"/>
+              </w:rPr>
+              <w:t>5</w:t>
+            </w:r>
+          </w:p>
+        </w:tc>
+        <w:tc>
+          <w:tcPr>
+            <w:tcW w:type="dxa" w:w="1481"/>
+            <w:vAlign w:val="center"/>
+          </w:tcPr>
+          <w:p>
+            <w:pPr>
+              <w:jc w:val="center"/>
+            </w:pPr>
+            <w:r>
+              <w:rPr>
+                <w:b w:val="0"/>
+                <w:sz w:val="13"/>
+              </w:rPr>
+              <w:t>5 dog</w:t>
+            </w:r>
+          </w:p>
+        </w:tc>
+        <w:tc>
+          <w:tcPr>
+            <w:tcW w:type="dxa" w:w="1481"/>
+            <w:vAlign w:val="center"/>
+          </w:tcPr>
+          <w:p>
+            <w:pPr>
+              <w:jc w:val="center"/>
+            </w:pPr>
+            <w:r>
+              <w:rPr>
+                <w:b w:val="0"/>
+                <w:sz w:val="13"/>
+              </w:rPr>
+              <w:t>3 cat</w:t>
+            </w:r>
+          </w:p>
+        </w:tc>
+        <w:tc>
+          <w:tcPr>
+            <w:tcW w:type="dxa" w:w="1481"/>
+            <w:vAlign w:val="center"/>
+          </w:tcPr>
+          <w:p>
+            <w:pPr>
+              <w:jc w:val="center"/>
+            </w:pPr>
+            <w:r>
+              <w:rPr>
+                <w:b w:val="0"/>
+                <w:sz w:val="13"/>
+              </w:rPr>
+              <w:t>1.0000</w:t>
+            </w:r>
+          </w:p>
+        </w:tc>
+        <w:tc>
+          <w:tcPr>
+            <w:tcW w:type="dxa" w:w="1481"/>
+            <w:vAlign w:val="center"/>
+          </w:tcPr>
+          <w:p>
+            <w:pPr>
+              <w:jc w:val="center"/>
+            </w:pPr>
+            <w:r>
+              <w:rPr>
+                <w:b w:val="0"/>
+                <w:sz w:val="13"/>
+              </w:rPr>
+              <w:t>4.01e-07</w:t>
+            </w:r>
+          </w:p>
+        </w:tc>
+      </w:tr>
+      <w:tr>
+        <w:tc>
+          <w:tcPr>
+            <w:tcW w:type="dxa" w:w="1481"/>
+            <w:vAlign w:val="center"/>
+          </w:tcPr>
+          <w:p>
+            <w:pPr>
+              <w:jc w:val="center"/>
+            </w:pPr>
+            <w:r>
+              <w:rPr>
+                <w:b w:val="0"/>
+                <w:sz w:val="13"/>
+              </w:rPr>
+              <w:t>Standard</w:t>
+            </w:r>
+          </w:p>
+        </w:tc>
+        <w:tc>
+          <w:tcPr>
+            <w:tcW w:type="dxa" w:w="1481"/>
+            <w:vAlign w:val="center"/>
+          </w:tcPr>
+          <w:p>
+            <w:pPr>
+              <w:jc w:val="center"/>
+            </w:pPr>
+            <w:r>
+              <w:rPr>
+                <w:b w:val="0"/>
+                <w:sz w:val="13"/>
+              </w:rPr>
+              <w:t>Fog</w:t>
+            </w:r>
+          </w:p>
+        </w:tc>
+        <w:tc>
+          <w:tcPr>
+            <w:tcW w:type="dxa" w:w="1481"/>
+            <w:vAlign w:val="center"/>
+          </w:tcPr>
+          <w:p>
+            <w:pPr>
+              <w:jc w:val="center"/>
+            </w:pPr>
+            <w:r>
+              <w:rPr>
+                <w:b w:val="0"/>
+                <w:sz w:val="13"/>
+              </w:rPr>
+              <w:t>3</w:t>
+            </w:r>
+          </w:p>
+        </w:tc>
+        <w:tc>
+          <w:tcPr>
+            <w:tcW w:type="dxa" w:w="1481"/>
+            <w:vAlign w:val="center"/>
+          </w:tcPr>
+          <w:p>
+            <w:pPr>
+              <w:jc w:val="center"/>
+            </w:pPr>
+            <w:r>
+              <w:rPr>
+                <w:b w:val="0"/>
+                <w:sz w:val="13"/>
+              </w:rPr>
+              <w:t>5 dog</w:t>
+            </w:r>
+          </w:p>
+        </w:tc>
+        <w:tc>
+          <w:tcPr>
+            <w:tcW w:type="dxa" w:w="1481"/>
+            <w:vAlign w:val="center"/>
+          </w:tcPr>
+          <w:p>
+            <w:pPr>
+              <w:jc w:val="center"/>
+            </w:pPr>
+            <w:r>
+              <w:rPr>
+                <w:b w:val="0"/>
+                <w:sz w:val="13"/>
+              </w:rPr>
+              <w:t>3 cat</w:t>
+            </w:r>
+          </w:p>
+        </w:tc>
+        <w:tc>
+          <w:tcPr>
+            <w:tcW w:type="dxa" w:w="1481"/>
+            <w:vAlign w:val="center"/>
+          </w:tcPr>
+          <w:p>
+            <w:pPr>
+              <w:jc w:val="center"/>
+            </w:pPr>
+            <w:r>
+              <w:rPr>
+                <w:b w:val="0"/>
+                <w:sz w:val="13"/>
+              </w:rPr>
+              <w:t>1.0000</w:t>
+            </w:r>
+          </w:p>
+        </w:tc>
+        <w:tc>
+          <w:tcPr>
+            <w:tcW w:type="dxa" w:w="1481"/>
+            <w:vAlign w:val="center"/>
+          </w:tcPr>
+          <w:p>
+            <w:pPr>
+              <w:jc w:val="center"/>
+            </w:pPr>
+            <w:r>
+              <w:rPr>
+                <w:b w:val="0"/>
+                <w:sz w:val="13"/>
+              </w:rPr>
+              <w:t>7.45e-07</w:t>
+            </w:r>
+          </w:p>
+        </w:tc>
+      </w:tr>
+      <w:tr>
+        <w:tc>
+          <w:tcPr>
+            <w:tcW w:type="dxa" w:w="1481"/>
+            <w:vAlign w:val="center"/>
+          </w:tcPr>
+          <w:p>
+            <w:pPr>
+              <w:jc w:val="center"/>
+            </w:pPr>
+            <w:r>
+              <w:rPr>
+                <w:b w:val="0"/>
+                <w:sz w:val="13"/>
+              </w:rPr>
+              <w:t>Standard</w:t>
+            </w:r>
+          </w:p>
+        </w:tc>
+        <w:tc>
+          <w:tcPr>
+            <w:tcW w:type="dxa" w:w="1481"/>
+            <w:vAlign w:val="center"/>
+          </w:tcPr>
+          <w:p>
+            <w:pPr>
+              <w:jc w:val="center"/>
+            </w:pPr>
+            <w:r>
+              <w:rPr>
+                <w:b w:val="0"/>
+                <w:sz w:val="13"/>
+              </w:rPr>
+              <w:t>Fog</w:t>
+            </w:r>
+          </w:p>
+        </w:tc>
+        <w:tc>
+          <w:tcPr>
+            <w:tcW w:type="dxa" w:w="1481"/>
+            <w:vAlign w:val="center"/>
+          </w:tcPr>
+          <w:p>
+            <w:pPr>
+              <w:jc w:val="center"/>
+            </w:pPr>
+            <w:r>
+              <w:rPr>
+                <w:b w:val="0"/>
+                <w:sz w:val="13"/>
+              </w:rPr>
+              <w:t>5</w:t>
+            </w:r>
+          </w:p>
+        </w:tc>
+        <w:tc>
+          <w:tcPr>
+            <w:tcW w:type="dxa" w:w="1481"/>
+            <w:vAlign w:val="center"/>
+          </w:tcPr>
+          <w:p>
+            <w:pPr>
+              <w:jc w:val="center"/>
+            </w:pPr>
+            <w:r>
+              <w:rPr>
+                <w:b w:val="0"/>
+                <w:sz w:val="13"/>
+              </w:rPr>
+              <w:t>6 frog</w:t>
+            </w:r>
+          </w:p>
+        </w:tc>
+        <w:tc>
+          <w:tcPr>
+            <w:tcW w:type="dxa" w:w="1481"/>
+            <w:vAlign w:val="center"/>
+          </w:tcPr>
+          <w:p>
+            <w:pPr>
+              <w:jc w:val="center"/>
+            </w:pPr>
+            <w:r>
+              <w:rPr>
+                <w:b w:val="0"/>
+                <w:sz w:val="13"/>
+              </w:rPr>
+              <w:t>3 cat</w:t>
+            </w:r>
+          </w:p>
+        </w:tc>
+        <w:tc>
+          <w:tcPr>
+            <w:tcW w:type="dxa" w:w="1481"/>
+            <w:vAlign w:val="center"/>
+          </w:tcPr>
+          <w:p>
+            <w:pPr>
+              <w:jc w:val="center"/>
+            </w:pPr>
+            <w:r>
+              <w:rPr>
+                <w:b w:val="0"/>
+                <w:sz w:val="13"/>
+              </w:rPr>
+              <w:t>1.0000</w:t>
+            </w:r>
+          </w:p>
+        </w:tc>
+        <w:tc>
+          <w:tcPr>
+            <w:tcW w:type="dxa" w:w="1481"/>
+            <w:vAlign w:val="center"/>
+          </w:tcPr>
+          <w:p>
+            <w:pPr>
+              <w:jc w:val="center"/>
+            </w:pPr>
+            <w:r>
+              <w:rPr>
+                <w:b w:val="0"/>
+                <w:sz w:val="13"/>
+              </w:rPr>
+              <w:t>1.67e-06</w:t>
+            </w:r>
+          </w:p>
+        </w:tc>
+      </w:tr>
+    </w:tbl>
+    <w:p/>
+    <w:p>
+      <w:pPr>
+        <w:jc w:val="center"/>
+      </w:pPr>
+      <w:r>
+        <w:rPr>
+          <w:i/>
+          <w:sz w:val="16"/>
+        </w:rPr>
+        <w:t>附錄表 A5。輸出的 high-confidence wrong examples 摘要。</w:t>
       </w:r>
     </w:p>
     <w:sectPr>

</xml_diff>